<commit_message>
Mechanical pending works batch
Schema.org and meta sweep:
- LinkedIn URL: nexsun-ai to twosuns
- X/Twitter URL: NexsunAI to TwoSunsAI
- Absolute URLs nexsun.ai to twosuns.ai (33 files)
- Schema.org name from "Nexsun.ai" to "TwoSuns"
- Press, book-discovery meta descriptions updated to coordination framing
- Footer brand lines: "Decision Intelligence · Persistent Coordination · TwoSuns Core" to "Coordination Infrastructure · Persistent Assistance · TwoSuns Core"

URL rename:
- why-nexsun.html copied to why-twosuns.html (old file kept as soft alias)
- 90 files updated to link to why-twosuns.html instead
- sitemap.xml updated to new URL and twosuns.ai domain

Verification:
- 0 displayed "Nexsun" mentions across live pages
- 0 files still link to why-nexsun.html

Co-Authored-By: Claude Opus 4.7 (1M context) <noreply@anthropic.com>
</commit_message>
<xml_diff>
--- a/docs/TwoSuns-Rebrand-Checklist.docx
+++ b/docs/TwoSuns-Rebrand-Checklist.docx
@@ -2,738 +2,1272 @@
 <file path=word/document.xml><?xml version="1.0" encoding="utf-8"?>
 <w:document xmlns:wpc="http://schemas.microsoft.com/office/word/2010/wordprocessingCanvas" xmlns:mo="http://schemas.microsoft.com/office/mac/office/2008/main" xmlns:mc="http://schemas.openxmlformats.org/markup-compatibility/2006" xmlns:mv="urn:schemas-microsoft-com:mac:vml" xmlns:o="urn:schemas-microsoft-com:office:office" xmlns:r="http://schemas.openxmlformats.org/officeDocument/2006/relationships" xmlns:m="http://schemas.openxmlformats.org/officeDocument/2006/math" xmlns:v="urn:schemas-microsoft-com:vml" xmlns:wp14="http://schemas.microsoft.com/office/word/2010/wordprocessingDrawing" xmlns:wp="http://schemas.openxmlformats.org/drawingml/2006/wordprocessingDrawing" xmlns:w10="urn:schemas-microsoft-com:office:word" xmlns:w="http://schemas.openxmlformats.org/wordprocessingml/2006/main" xmlns:w14="http://schemas.microsoft.com/office/word/2010/wordml" xmlns:wpg="http://schemas.microsoft.com/office/word/2010/wordprocessingGroup" xmlns:wpi="http://schemas.microsoft.com/office/word/2010/wordprocessingInk" xmlns:wne="http://schemas.microsoft.com/office/word/2006/wordml" xmlns:wps="http://schemas.microsoft.com/office/word/2010/wordprocessingShape" mc:Ignorable="w14 wp14">
   <w:body>
+    <w:tbl>
+      <w:tblPr>
+        <w:tblW w:type="auto" w:w="0"/>
+        <w:jc w:val="center"/>
+        <w:tblLook w:firstColumn="1" w:firstRow="1" w:lastColumn="0" w:lastRow="0" w:noHBand="0" w:noVBand="1" w:val="04A0"/>
+      </w:tblPr>
+      <w:tblGrid>
+        <w:gridCol w:w="9648"/>
+      </w:tblGrid>
+      <w:tr>
+        <w:tc>
+          <w:tcPr>
+            <w:tcW w:type="dxa" w:w="9648"/>
+            <w:shd w:val="clear" w:color="auto" w:fill="163E64"/>
+            <w:tcBorders>
+              <w:top w:val="nil"/>
+              <w:left w:val="nil"/>
+              <w:bottom w:val="nil"/>
+              <w:right w:val="nil"/>
+            </w:tcBorders>
+            <w:vAlign w:val="center"/>
+          </w:tcPr>
+          <w:p>
+            <w:pPr>
+              <w:spacing w:before="400" w:after="0"/>
+              <w:jc w:val="center"/>
+            </w:pPr>
+            <w:r>
+              <w:rPr>
+                <w:color w:val="F6B707"/>
+                <w:sz w:val="56"/>
+              </w:rPr>
+              <w:t>☀ ☼</w:t>
+            </w:r>
+          </w:p>
+          <w:p>
+            <w:pPr>
+              <w:spacing w:before="80" w:after="40"/>
+              <w:jc w:val="center"/>
+            </w:pPr>
+            <w:r>
+              <w:rPr>
+                <w:rFonts w:ascii="Helvetica Neue" w:hAnsi="Helvetica Neue"/>
+                <w:b/>
+                <w:caps/>
+                <w:color w:val="F6B707"/>
+                <w:sz w:val="22"/>
+              </w:rPr>
+              <w:t>TWOSUNS REBRAND CHECKLIST</w:t>
+            </w:r>
+          </w:p>
+          <w:p>
+            <w:pPr>
+              <w:spacing w:after="80"/>
+              <w:jc w:val="center"/>
+            </w:pPr>
+            <w:r>
+              <w:rPr>
+                <w:rFonts w:ascii="Helvetica Neue" w:hAnsi="Helvetica Neue"/>
+                <w:b/>
+                <w:color w:val="FFFFFF"/>
+                <w:sz w:val="52"/>
+              </w:rPr>
+              <w:t>Status of the Brand Pivot</w:t>
+            </w:r>
+          </w:p>
+          <w:p>
+            <w:pPr>
+              <w:spacing w:after="400"/>
+              <w:jc w:val="center"/>
+            </w:pPr>
+            <w:r>
+              <w:rPr>
+                <w:rFonts w:ascii="Helvetica Neue" w:hAnsi="Helvetica Neue"/>
+                <w:i/>
+                <w:color w:val="D9E2EC"/>
+                <w:sz w:val="22"/>
+              </w:rPr>
+              <w:t>From Nexsun.ai to TwoSuns,  across all 93 pages</w:t>
+            </w:r>
+          </w:p>
+        </w:tc>
+      </w:tr>
+    </w:tbl>
     <w:p>
       <w:pPr>
         <w:spacing w:after="80"/>
       </w:pPr>
-      <w:r>
-        <w:rPr>
-          <w:b/>
-          <w:color w:val="163E64"/>
-          <w:sz w:val="52"/>
-        </w:rPr>
-        <w:t>TwoSuns Rebrand Checklist</w:t>
-      </w:r>
+    </w:p>
+    <w:tbl>
+      <w:tblPr>
+        <w:tblW w:type="auto" w:w="0"/>
+        <w:jc w:val="center"/>
+        <w:tblLook w:firstColumn="1" w:firstRow="1" w:lastColumn="0" w:lastRow="0" w:noHBand="0" w:noVBand="1" w:val="04A0"/>
+      </w:tblPr>
+      <w:tblGrid>
+        <w:gridCol w:w="2412"/>
+        <w:gridCol w:w="2412"/>
+        <w:gridCol w:w="2412"/>
+        <w:gridCol w:w="2412"/>
+      </w:tblGrid>
+      <w:tr>
+        <w:tc>
+          <w:tcPr>
+            <w:tcW w:type="dxa" w:w="2412"/>
+            <w:shd w:val="clear" w:color="auto" w:fill="F8FAFC"/>
+            <w:tcBorders>
+              <w:top w:val="single" w:sz="4" w:color="E2E8F0"/>
+              <w:left w:val="single" w:sz="4" w:color="E2E8F0"/>
+              <w:bottom w:val="single" w:sz="4" w:color="E2E8F0"/>
+              <w:right w:val="single" w:sz="4" w:color="E2E8F0"/>
+            </w:tcBorders>
+            <w:vAlign w:val="center"/>
+          </w:tcPr>
+          <w:p>
+            <w:pPr>
+              <w:spacing w:before="120" w:after="40"/>
+              <w:jc w:val="center"/>
+            </w:pPr>
+            <w:r>
+              <w:rPr>
+                <w:rFonts w:ascii="Helvetica Neue" w:hAnsi="Helvetica Neue"/>
+                <w:b/>
+                <w:color w:val="E95704"/>
+                <w:sz w:val="16"/>
+              </w:rPr>
+              <w:t>SOURCE DOC</w:t>
+            </w:r>
+          </w:p>
+          <w:p>
+            <w:pPr>
+              <w:spacing w:after="120"/>
+              <w:jc w:val="center"/>
+            </w:pPr>
+            <w:r>
+              <w:rPr>
+                <w:rFonts w:ascii="Helvetica Neue" w:hAnsi="Helvetica Neue"/>
+                <w:b/>
+                <w:color w:val="163E64"/>
+                <w:sz w:val="19"/>
+              </w:rPr>
+              <w:t>TwoSuns Web Content v1</w:t>
+            </w:r>
+          </w:p>
+        </w:tc>
+        <w:tc>
+          <w:tcPr>
+            <w:tcW w:type="dxa" w:w="2412"/>
+            <w:shd w:val="clear" w:color="auto" w:fill="F8FAFC"/>
+            <w:tcBorders>
+              <w:top w:val="single" w:sz="4" w:color="E2E8F0"/>
+              <w:left w:val="single" w:sz="4" w:color="E2E8F0"/>
+              <w:bottom w:val="single" w:sz="4" w:color="E2E8F0"/>
+              <w:right w:val="single" w:sz="4" w:color="E2E8F0"/>
+            </w:tcBorders>
+            <w:vAlign w:val="center"/>
+          </w:tcPr>
+          <w:p>
+            <w:pPr>
+              <w:spacing w:before="120" w:after="40"/>
+              <w:jc w:val="center"/>
+            </w:pPr>
+            <w:r>
+              <w:rPr>
+                <w:rFonts w:ascii="Helvetica Neue" w:hAnsi="Helvetica Neue"/>
+                <w:b/>
+                <w:color w:val="E95704"/>
+                <w:sz w:val="16"/>
+              </w:rPr>
+              <w:t>PIVOT</w:t>
+            </w:r>
+          </w:p>
+          <w:p>
+            <w:pPr>
+              <w:spacing w:after="120"/>
+              <w:jc w:val="center"/>
+            </w:pPr>
+            <w:r>
+              <w:rPr>
+                <w:rFonts w:ascii="Helvetica Neue" w:hAnsi="Helvetica Neue"/>
+                <w:b/>
+                <w:color w:val="163E64"/>
+                <w:sz w:val="19"/>
+              </w:rPr>
+              <w:t>Nexsun → TwoSuns</w:t>
+            </w:r>
+          </w:p>
+        </w:tc>
+        <w:tc>
+          <w:tcPr>
+            <w:tcW w:type="dxa" w:w="2412"/>
+            <w:shd w:val="clear" w:color="auto" w:fill="F8FAFC"/>
+            <w:tcBorders>
+              <w:top w:val="single" w:sz="4" w:color="E2E8F0"/>
+              <w:left w:val="single" w:sz="4" w:color="E2E8F0"/>
+              <w:bottom w:val="single" w:sz="4" w:color="E2E8F0"/>
+              <w:right w:val="single" w:sz="4" w:color="E2E8F0"/>
+            </w:tcBorders>
+            <w:vAlign w:val="center"/>
+          </w:tcPr>
+          <w:p>
+            <w:pPr>
+              <w:spacing w:before="120" w:after="40"/>
+              <w:jc w:val="center"/>
+            </w:pPr>
+            <w:r>
+              <w:rPr>
+                <w:rFonts w:ascii="Helvetica Neue" w:hAnsi="Helvetica Neue"/>
+                <w:b/>
+                <w:color w:val="E95704"/>
+                <w:sz w:val="16"/>
+              </w:rPr>
+              <w:t>UPDATED</w:t>
+            </w:r>
+          </w:p>
+          <w:p>
+            <w:pPr>
+              <w:spacing w:after="120"/>
+              <w:jc w:val="center"/>
+            </w:pPr>
+            <w:r>
+              <w:rPr>
+                <w:rFonts w:ascii="Helvetica Neue" w:hAnsi="Helvetica Neue"/>
+                <w:b/>
+                <w:color w:val="163E64"/>
+                <w:sz w:val="19"/>
+              </w:rPr>
+              <w:t>2026-04-30</w:t>
+            </w:r>
+          </w:p>
+        </w:tc>
+        <w:tc>
+          <w:tcPr>
+            <w:tcW w:type="dxa" w:w="2412"/>
+            <w:shd w:val="clear" w:color="auto" w:fill="F8FAFC"/>
+            <w:tcBorders>
+              <w:top w:val="single" w:sz="4" w:color="E2E8F0"/>
+              <w:left w:val="single" w:sz="4" w:color="E2E8F0"/>
+              <w:bottom w:val="single" w:sz="4" w:color="E2E8F0"/>
+              <w:right w:val="single" w:sz="4" w:color="E2E8F0"/>
+            </w:tcBorders>
+            <w:vAlign w:val="center"/>
+          </w:tcPr>
+          <w:p>
+            <w:pPr>
+              <w:spacing w:before="120" w:after="40"/>
+              <w:jc w:val="center"/>
+            </w:pPr>
+            <w:r>
+              <w:rPr>
+                <w:rFonts w:ascii="Helvetica Neue" w:hAnsi="Helvetica Neue"/>
+                <w:b/>
+                <w:color w:val="E95704"/>
+                <w:sz w:val="16"/>
+              </w:rPr>
+              <w:t>STATUS</w:t>
+            </w:r>
+          </w:p>
+          <w:p>
+            <w:pPr>
+              <w:spacing w:after="120"/>
+              <w:jc w:val="center"/>
+            </w:pPr>
+            <w:r>
+              <w:rPr>
+                <w:rFonts w:ascii="Helvetica Neue" w:hAnsi="Helvetica Neue"/>
+                <w:b/>
+                <w:color w:val="163E64"/>
+                <w:sz w:val="19"/>
+              </w:rPr>
+              <w:t>Mechanical complete</w:t>
+            </w:r>
+          </w:p>
+        </w:tc>
+      </w:tr>
+    </w:tbl>
+    <w:p>
+      <w:pPr>
+        <w:spacing w:after="160"/>
+      </w:pPr>
     </w:p>
     <w:p>
       <w:pPr>
-        <w:spacing w:after="320"/>
+        <w:spacing w:after="160"/>
+        <w:jc w:val="center"/>
       </w:pPr>
       <w:r>
         <w:rPr>
-          <w:color w:val="64748B"/>
-          <w:sz w:val="22"/>
+          <w:rFonts w:ascii="Helvetica Neue" w:hAnsi="Helvetica Neue"/>
+          <w:b/>
+          <w:i w:val="0"/>
+          <w:color w:val="163E64"/>
+          <w:sz w:val="28"/>
         </w:rPr>
-        <w:t>Status of the brand pivot from Nexsun.ai to TwoSuns across the live site.</w:t>
+        <w:t>Progress at a glance</w:t>
+      </w:r>
+    </w:p>
+    <w:tbl>
+      <w:tblPr>
+        <w:tblW w:type="auto" w:w="0"/>
+        <w:jc w:val="center"/>
+        <w:tblLook w:firstColumn="1" w:firstRow="1" w:lastColumn="0" w:lastRow="0" w:noHBand="0" w:noVBand="1" w:val="04A0"/>
+      </w:tblPr>
+      <w:tblGrid>
+        <w:gridCol w:w="2412"/>
+        <w:gridCol w:w="2412"/>
+        <w:gridCol w:w="2412"/>
+        <w:gridCol w:w="2412"/>
+      </w:tblGrid>
+      <w:tr>
+        <w:tc>
+          <w:tcPr>
+            <w:tcW w:type="dxa" w:w="2412"/>
+            <w:shd w:val="clear" w:color="auto" w:fill="163E64"/>
+            <w:tcBorders>
+              <w:top w:val="nil"/>
+              <w:left w:val="nil"/>
+              <w:bottom w:val="nil"/>
+              <w:right w:val="nil"/>
+            </w:tcBorders>
+            <w:vAlign w:val="center"/>
+          </w:tcPr>
+          <w:p>
+            <w:pPr>
+              <w:spacing w:before="120" w:after="40"/>
+              <w:jc w:val="center"/>
+            </w:pPr>
+            <w:r>
+              <w:rPr>
+                <w:rFonts w:ascii="Helvetica Neue" w:hAnsi="Helvetica Neue"/>
+                <w:b/>
+                <w:color w:val="FFFFFF"/>
+                <w:sz w:val="44"/>
+              </w:rPr>
+              <w:t>93</w:t>
+            </w:r>
+          </w:p>
+          <w:p>
+            <w:pPr>
+              <w:spacing w:before="0" w:after="160"/>
+              <w:jc w:val="center"/>
+            </w:pPr>
+            <w:r>
+              <w:rPr>
+                <w:rFonts w:ascii="Helvetica Neue" w:hAnsi="Helvetica Neue"/>
+                <w:b/>
+                <w:color w:val="FFFFFF"/>
+                <w:sz w:val="17"/>
+              </w:rPr>
+              <w:t>Pages updated</w:t>
+            </w:r>
+          </w:p>
+        </w:tc>
+        <w:tc>
+          <w:tcPr>
+            <w:tcW w:type="dxa" w:w="2412"/>
+            <w:shd w:val="clear" w:color="auto" w:fill="16A34A"/>
+            <w:tcBorders>
+              <w:top w:val="nil"/>
+              <w:left w:val="nil"/>
+              <w:bottom w:val="nil"/>
+              <w:right w:val="nil"/>
+            </w:tcBorders>
+            <w:vAlign w:val="center"/>
+          </w:tcPr>
+          <w:p>
+            <w:pPr>
+              <w:spacing w:before="120" w:after="40"/>
+              <w:jc w:val="center"/>
+            </w:pPr>
+            <w:r>
+              <w:rPr>
+                <w:rFonts w:ascii="Helvetica Neue" w:hAnsi="Helvetica Neue"/>
+                <w:b/>
+                <w:color w:val="FFFFFF"/>
+                <w:sz w:val="44"/>
+              </w:rPr>
+              <w:t>0</w:t>
+            </w:r>
+          </w:p>
+          <w:p>
+            <w:pPr>
+              <w:spacing w:before="0" w:after="160"/>
+              <w:jc w:val="center"/>
+            </w:pPr>
+            <w:r>
+              <w:rPr>
+                <w:rFonts w:ascii="Helvetica Neue" w:hAnsi="Helvetica Neue"/>
+                <w:b/>
+                <w:color w:val="FFFFFF"/>
+                <w:sz w:val="17"/>
+              </w:rPr>
+              <w:t>Brand mentions live</w:t>
+            </w:r>
+          </w:p>
+        </w:tc>
+        <w:tc>
+          <w:tcPr>
+            <w:tcW w:type="dxa" w:w="2412"/>
+            <w:shd w:val="clear" w:color="auto" w:fill="E95704"/>
+            <w:tcBorders>
+              <w:top w:val="nil"/>
+              <w:left w:val="nil"/>
+              <w:bottom w:val="nil"/>
+              <w:right w:val="nil"/>
+            </w:tcBorders>
+            <w:vAlign w:val="center"/>
+          </w:tcPr>
+          <w:p>
+            <w:pPr>
+              <w:spacing w:before="120" w:after="40"/>
+              <w:jc w:val="center"/>
+            </w:pPr>
+            <w:r>
+              <w:rPr>
+                <w:rFonts w:ascii="Helvetica Neue" w:hAnsi="Helvetica Neue"/>
+                <w:b/>
+                <w:color w:val="FFFFFF"/>
+                <w:sz w:val="44"/>
+              </w:rPr>
+              <w:t>28</w:t>
+            </w:r>
+          </w:p>
+          <w:p>
+            <w:pPr>
+              <w:spacing w:before="0" w:after="160"/>
+              <w:jc w:val="center"/>
+            </w:pPr>
+            <w:r>
+              <w:rPr>
+                <w:rFonts w:ascii="Helvetica Neue" w:hAnsi="Helvetica Neue"/>
+                <w:b/>
+                <w:color w:val="FFFFFF"/>
+                <w:sz w:val="17"/>
+              </w:rPr>
+              <w:t>Pending pages</w:t>
+            </w:r>
+          </w:p>
+        </w:tc>
+        <w:tc>
+          <w:tcPr>
+            <w:tcW w:type="dxa" w:w="2412"/>
+            <w:shd w:val="clear" w:color="auto" w:fill="F4920B"/>
+            <w:tcBorders>
+              <w:top w:val="nil"/>
+              <w:left w:val="nil"/>
+              <w:bottom w:val="nil"/>
+              <w:right w:val="nil"/>
+            </w:tcBorders>
+            <w:vAlign w:val="center"/>
+          </w:tcPr>
+          <w:p>
+            <w:pPr>
+              <w:spacing w:before="120" w:after="40"/>
+              <w:jc w:val="center"/>
+            </w:pPr>
+            <w:r>
+              <w:rPr>
+                <w:rFonts w:ascii="Helvetica Neue" w:hAnsi="Helvetica Neue"/>
+                <w:b/>
+                <w:color w:val="FFFFFF"/>
+                <w:sz w:val="44"/>
+              </w:rPr>
+              <w:t>11</w:t>
+            </w:r>
+          </w:p>
+          <w:p>
+            <w:pPr>
+              <w:spacing w:before="0" w:after="160"/>
+              <w:jc w:val="center"/>
+            </w:pPr>
+            <w:r>
+              <w:rPr>
+                <w:rFonts w:ascii="Helvetica Neue" w:hAnsi="Helvetica Neue"/>
+                <w:b/>
+                <w:color w:val="FFFFFF"/>
+                <w:sz w:val="17"/>
+              </w:rPr>
+              <w:t>New sections</w:t>
+            </w:r>
+          </w:p>
+        </w:tc>
+      </w:tr>
+    </w:tbl>
+    <w:p>
+      <w:pPr>
+        <w:spacing w:after="280"/>
+      </w:pPr>
+    </w:p>
+    <w:p>
+      <w:pPr>
+        <w:spacing w:before="160" w:after="160"/>
+        <w:pBdr>
+          <w:bottom w:val="single" w:sz="18" w:space="1" w:color="F4920B"/>
+        </w:pBdr>
+      </w:pPr>
+    </w:p>
+    <w:p>
+      <w:pPr>
+        <w:spacing w:after="160"/>
+      </w:pPr>
+    </w:p>
+    <w:tbl>
+      <w:tblPr>
+        <w:tblW w:type="auto" w:w="0"/>
+        <w:jc w:val="left"/>
+        <w:tblLook w:firstColumn="1" w:firstRow="1" w:lastColumn="0" w:lastRow="0" w:noHBand="0" w:noVBand="1" w:val="04A0"/>
+      </w:tblPr>
+      <w:tblGrid>
+        <w:gridCol w:w="9648"/>
+      </w:tblGrid>
+      <w:tr>
+        <w:tc>
+          <w:tcPr>
+            <w:tcW w:type="dxa" w:w="9648"/>
+            <w:shd w:val="clear" w:color="auto" w:fill="163E64"/>
+            <w:tcBorders>
+              <w:top w:val="nil"/>
+              <w:left w:val="nil"/>
+              <w:bottom w:val="nil"/>
+              <w:right w:val="nil"/>
+            </w:tcBorders>
+            <w:vAlign w:val="center"/>
+          </w:tcPr>
+          <w:p>
+            <w:pPr>
+              <w:spacing w:before="40" w:after="40"/>
+              <w:ind w:left="259"/>
+            </w:pPr>
+            <w:r>
+              <w:rPr>
+                <w:rFonts w:ascii="Helvetica Neue" w:hAnsi="Helvetica Neue"/>
+                <w:b/>
+                <w:color w:val="F6B707"/>
+                <w:sz w:val="40"/>
+              </w:rPr>
+              <w:t xml:space="preserve"> A  </w:t>
+            </w:r>
+            <w:r>
+              <w:rPr>
+                <w:rFonts w:ascii="Helvetica Neue" w:hAnsi="Helvetica Neue"/>
+                <w:b/>
+                <w:color w:val="FFFFFF"/>
+                <w:sz w:val="30"/>
+              </w:rPr>
+              <w:t>Completed and live on the site</w:t>
+            </w:r>
+            <w:r>
+              <w:rPr>
+                <w:rFonts w:ascii="Helvetica Neue" w:hAnsi="Helvetica Neue"/>
+                <w:color w:val="F6B707"/>
+                <w:sz w:val="20"/>
+              </w:rPr>
+              <w:t xml:space="preserve">   18/18 done</w:t>
+            </w:r>
+          </w:p>
+        </w:tc>
+      </w:tr>
+    </w:tbl>
+    <w:p>
+      <w:pPr>
+        <w:spacing w:after="120"/>
+      </w:pPr>
+    </w:p>
+    <w:p>
+      <w:pPr>
+        <w:spacing w:before="200" w:after="80"/>
+      </w:pPr>
+      <w:r>
+        <w:rPr>
+          <w:rFonts w:ascii="Helvetica Neue" w:hAnsi="Helvetica Neue"/>
+          <w:b/>
+          <w:color w:val="E95704"/>
+          <w:sz w:val="23"/>
+        </w:rPr>
+        <w:t>A1 · Brand and identity</w:t>
       </w:r>
     </w:p>
     <w:p>
       <w:pPr>
         <w:spacing w:after="40"/>
+        <w:ind w:left="216"/>
       </w:pPr>
       <w:r>
         <w:rPr>
+          <w:rFonts w:ascii="Helvetica Neue" w:hAnsi="Helvetica Neue"/>
           <w:b/>
-          <w:color w:val="163E64"/>
-          <w:sz w:val="20"/>
+          <w:color w:val="16A34A"/>
+          <w:sz w:val="22"/>
         </w:rPr>
-        <w:t xml:space="preserve">Source doc: </w:t>
+        <w:t xml:space="preserve">✔  </w:t>
       </w:r>
       <w:r>
         <w:rPr>
+          <w:rFonts w:ascii="Helvetica Neue" w:hAnsi="Helvetica Neue"/>
           <w:color w:val="3A3A3A"/>
           <w:sz w:val="20"/>
-        </w:rPr>
-        <w:t>TwoSuns Web Content v1 (provided 2026-04-30)</w:t>
-      </w:r>
-    </w:p>
-    <w:p>
-      <w:pPr>
-        <w:spacing w:after="40"/>
-      </w:pPr>
-      <w:r>
-        <w:rPr>
-          <w:b/>
-          <w:color w:val="163E64"/>
-          <w:sz w:val="20"/>
-        </w:rPr>
-        <w:t xml:space="preserve">Brand pivot: </w:t>
-      </w:r>
-      <w:r>
-        <w:rPr>
-          <w:color w:val="3A3A3A"/>
-          <w:sz w:val="20"/>
-        </w:rPr>
-        <w:t>Nexsun.ai to TwoSuns</w:t>
-      </w:r>
-    </w:p>
-    <w:p>
-      <w:pPr>
-        <w:spacing w:after="40"/>
-      </w:pPr>
-      <w:r>
-        <w:rPr>
-          <w:b/>
-          <w:color w:val="163E64"/>
-          <w:sz w:val="20"/>
-        </w:rPr>
-        <w:t xml:space="preserve">Last updated: </w:t>
-      </w:r>
-      <w:r>
-        <w:rPr>
-          <w:color w:val="3A3A3A"/>
-          <w:sz w:val="20"/>
-        </w:rPr>
-        <w:t>2026-04-30</w:t>
-      </w:r>
-    </w:p>
-    <w:p>
-      <w:pPr>
-        <w:spacing w:after="40"/>
-      </w:pPr>
-      <w:r>
-        <w:rPr>
-          <w:b/>
-          <w:color w:val="163E64"/>
-          <w:sz w:val="20"/>
-        </w:rPr>
-        <w:t xml:space="preserve">Status: </w:t>
-      </w:r>
-      <w:r>
-        <w:rPr>
-          <w:color w:val="3A3A3A"/>
-          <w:sz w:val="20"/>
-        </w:rPr>
-        <w:t>Mechanical rebrand complete. Per-page content polish pending.</w:t>
-      </w:r>
-    </w:p>
-    <w:p>
-      <w:pPr>
-        <w:spacing w:before="240" w:after="240"/>
-      </w:pPr>
-      <w:r>
-        <w:rPr>
-          <w:color w:val="CCCCCC"/>
-          <w:sz w:val="16"/>
-        </w:rPr>
-        <w:t>______________________________________________________________________</w:t>
-      </w:r>
-    </w:p>
-    <w:p>
-      <w:pPr>
-        <w:spacing w:before="400" w:after="120"/>
-      </w:pPr>
-      <w:r>
-        <w:rPr>
-          <w:b/>
-          <w:color w:val="E95704"/>
-          <w:sz w:val="36"/>
-        </w:rPr>
-        <w:t>A. Completed (live on the site)</w:t>
-      </w:r>
-    </w:p>
-    <w:p>
-      <w:pPr>
-        <w:spacing w:before="240" w:after="80"/>
-      </w:pPr>
-      <w:r>
-        <w:rPr>
-          <w:b/>
-          <w:color w:val="E95704"/>
-          <w:sz w:val="26"/>
-        </w:rPr>
-        <w:t>A1. Brand and identity</w:t>
-      </w:r>
-    </w:p>
-    <w:p>
-      <w:pPr>
-        <w:spacing w:after="60"/>
-        <w:ind w:left="360"/>
-      </w:pPr>
-      <w:r>
-        <w:rPr>
-          <w:b/>
-          <w:color w:val="E95704"/>
-          <w:sz w:val="22"/>
-        </w:rPr>
-        <w:t xml:space="preserve">☑  </w:t>
-      </w:r>
-      <w:r>
-        <w:rPr>
-          <w:color w:val="3A3A3A"/>
-          <w:sz w:val="21"/>
         </w:rPr>
         <w:t>Logo files swapped site-wide (logo-horizontal.svg, logo-color.svg) to TwoSuns wordmark</w:t>
       </w:r>
     </w:p>
     <w:p>
       <w:pPr>
-        <w:spacing w:after="60"/>
-        <w:ind w:left="360"/>
+        <w:spacing w:after="40"/>
+        <w:ind w:left="216"/>
       </w:pPr>
       <w:r>
         <w:rPr>
+          <w:rFonts w:ascii="Helvetica Neue" w:hAnsi="Helvetica Neue"/>
           <w:b/>
-          <w:color w:val="E95704"/>
+          <w:color w:val="16A34A"/>
           <w:sz w:val="22"/>
         </w:rPr>
-        <w:t xml:space="preserve">☑  </w:t>
+        <w:t xml:space="preserve">✔  </w:t>
       </w:r>
       <w:r>
         <w:rPr>
+          <w:rFonts w:ascii="Helvetica Neue" w:hAnsi="Helvetica Neue"/>
           <w:color w:val="3A3A3A"/>
-          <w:sz w:val="21"/>
+          <w:sz w:val="20"/>
         </w:rPr>
         <w:t>Old Nexsun horizontal logo backed up at .logo-backups/logo-horizontal.svg.bak</w:t>
       </w:r>
     </w:p>
     <w:p>
       <w:pPr>
-        <w:spacing w:after="60"/>
-        <w:ind w:left="360"/>
+        <w:spacing w:after="40"/>
+        <w:ind w:left="216"/>
       </w:pPr>
       <w:r>
         <w:rPr>
+          <w:rFonts w:ascii="Helvetica Neue" w:hAnsi="Helvetica Neue"/>
           <w:b/>
-          <w:color w:val="E95704"/>
+          <w:color w:val="16A34A"/>
           <w:sz w:val="22"/>
         </w:rPr>
-        <w:t xml:space="preserve">☑  </w:t>
+        <w:t xml:space="preserve">✔  </w:t>
       </w:r>
       <w:r>
         <w:rPr>
+          <w:rFonts w:ascii="Helvetica Neue" w:hAnsi="Helvetica Neue"/>
           <w:color w:val="3A3A3A"/>
-          <w:sz w:val="21"/>
+          <w:sz w:val="20"/>
         </w:rPr>
         <w:t>Nexsun.ai replaced with TwoSuns across 93 HTML files</w:t>
       </w:r>
     </w:p>
     <w:p>
       <w:pPr>
-        <w:spacing w:after="60"/>
-        <w:ind w:left="360"/>
+        <w:spacing w:after="40"/>
+        <w:ind w:left="216"/>
       </w:pPr>
       <w:r>
         <w:rPr>
+          <w:rFonts w:ascii="Helvetica Neue" w:hAnsi="Helvetica Neue"/>
           <w:b/>
-          <w:color w:val="E95704"/>
+          <w:color w:val="16A34A"/>
           <w:sz w:val="22"/>
         </w:rPr>
-        <w:t xml:space="preserve">☑  </w:t>
+        <w:t xml:space="preserve">✔  </w:t>
       </w:r>
       <w:r>
         <w:rPr>
+          <w:rFonts w:ascii="Helvetica Neue" w:hAnsi="Helvetica Neue"/>
           <w:color w:val="3A3A3A"/>
-          <w:sz w:val="21"/>
+          <w:sz w:val="20"/>
         </w:rPr>
-        <w:t>Split-span Nexsun.ai patterns cleaned up on index, about, applications, investors</w:t>
+        <w:t>Split-span Nexsun.ai patterns cleaned up on all pages</w:t>
       </w:r>
     </w:p>
     <w:p>
       <w:pPr>
-        <w:spacing w:after="60"/>
-        <w:ind w:left="360"/>
+        <w:spacing w:after="40"/>
+        <w:ind w:left="216"/>
       </w:pPr>
       <w:r>
         <w:rPr>
+          <w:rFonts w:ascii="Helvetica Neue" w:hAnsi="Helvetica Neue"/>
           <w:b/>
-          <w:color w:val="E95704"/>
+          <w:color w:val="16A34A"/>
           <w:sz w:val="22"/>
         </w:rPr>
-        <w:t xml:space="preserve">☑  </w:t>
+        <w:t xml:space="preserve">✔  </w:t>
       </w:r>
       <w:r>
         <w:rPr>
+          <w:rFonts w:ascii="Helvetica Neue" w:hAnsi="Helvetica Neue"/>
           <w:color w:val="3A3A3A"/>
-          <w:sz w:val="21"/>
+          <w:sz w:val="20"/>
         </w:rPr>
-        <w:t>Page title rewrite: TwoSuns, Coordination Infrastructure for Complex Enterprises</w:t>
+        <w:t>Page title: TwoSuns, Coordination Infrastructure for Complex Enterprises</w:t>
       </w:r>
     </w:p>
     <w:p>
       <w:pPr>
-        <w:spacing w:before="240" w:after="80"/>
+        <w:spacing w:before="200" w:after="80"/>
       </w:pPr>
       <w:r>
         <w:rPr>
+          <w:rFonts w:ascii="Helvetica Neue" w:hAnsi="Helvetica Neue"/>
           <w:b/>
           <w:color w:val="E95704"/>
-          <w:sz w:val="26"/>
+          <w:sz w:val="23"/>
         </w:rPr>
-        <w:t>A2. Terminology swaps (site-wide)</w:t>
+        <w:t>A2 · Terminology swaps (site-wide)</w:t>
       </w:r>
     </w:p>
     <w:p>
       <w:pPr>
-        <w:spacing w:after="60"/>
-        <w:ind w:left="360"/>
+        <w:spacing w:after="40"/>
+        <w:ind w:left="216"/>
       </w:pPr>
       <w:r>
         <w:rPr>
+          <w:rFonts w:ascii="Helvetica Neue" w:hAnsi="Helvetica Neue"/>
           <w:b/>
-          <w:color w:val="E95704"/>
+          <w:color w:val="16A34A"/>
           <w:sz w:val="22"/>
         </w:rPr>
-        <w:t xml:space="preserve">☑  </w:t>
+        <w:t xml:space="preserve">✔  </w:t>
       </w:r>
       <w:r>
         <w:rPr>
+          <w:rFonts w:ascii="Helvetica Neue" w:hAnsi="Helvetica Neue"/>
           <w:color w:val="3A3A3A"/>
-          <w:sz w:val="21"/>
+          <w:sz w:val="20"/>
         </w:rPr>
-        <w:t>Personal Intelligence Assistant (PIA) to TwoSuns Assistant</w:t>
+        <w:t>Personal Intelligence Assistant (PIA) → TwoSuns Assistant</w:t>
       </w:r>
     </w:p>
     <w:p>
       <w:pPr>
-        <w:spacing w:after="60"/>
-        <w:ind w:left="360"/>
+        <w:spacing w:after="40"/>
+        <w:ind w:left="216"/>
       </w:pPr>
       <w:r>
         <w:rPr>
+          <w:rFonts w:ascii="Helvetica Neue" w:hAnsi="Helvetica Neue"/>
           <w:b/>
-          <w:color w:val="E95704"/>
+          <w:color w:val="16A34A"/>
           <w:sz w:val="22"/>
         </w:rPr>
-        <w:t xml:space="preserve">☑  </w:t>
+        <w:t xml:space="preserve">✔  </w:t>
       </w:r>
       <w:r>
         <w:rPr>
+          <w:rFonts w:ascii="Helvetica Neue" w:hAnsi="Helvetica Neue"/>
           <w:color w:val="3A3A3A"/>
-          <w:sz w:val="21"/>
+          <w:sz w:val="20"/>
         </w:rPr>
-        <w:t>System of Decision Record / SoDR to TwoSuns Core</w:t>
+        <w:t>System of Decision Record / SoDR → TwoSuns Core</w:t>
       </w:r>
     </w:p>
     <w:p>
       <w:pPr>
-        <w:spacing w:after="60"/>
-        <w:ind w:left="360"/>
+        <w:spacing w:after="40"/>
+        <w:ind w:left="216"/>
       </w:pPr>
       <w:r>
         <w:rPr>
+          <w:rFonts w:ascii="Helvetica Neue" w:hAnsi="Helvetica Neue"/>
           <w:b/>
-          <w:color w:val="E95704"/>
+          <w:color w:val="16A34A"/>
           <w:sz w:val="22"/>
         </w:rPr>
-        <w:t xml:space="preserve">☑  </w:t>
+        <w:t xml:space="preserve">✔  </w:t>
       </w:r>
       <w:r>
         <w:rPr>
+          <w:rFonts w:ascii="Helvetica Neue" w:hAnsi="Helvetica Neue"/>
           <w:color w:val="3A3A3A"/>
-          <w:sz w:val="21"/>
+          <w:sz w:val="20"/>
         </w:rPr>
-        <w:t>Glassbox AI / Glassbox to Persistent Coordination</w:t>
+        <w:t>Glassbox AI / Glassbox → Persistent Coordination</w:t>
       </w:r>
     </w:p>
     <w:p>
       <w:pPr>
-        <w:spacing w:after="60"/>
-        <w:ind w:left="360"/>
+        <w:spacing w:after="40"/>
+        <w:ind w:left="216"/>
       </w:pPr>
       <w:r>
         <w:rPr>
+          <w:rFonts w:ascii="Helvetica Neue" w:hAnsi="Helvetica Neue"/>
           <w:b/>
-          <w:color w:val="E95704"/>
+          <w:color w:val="16A34A"/>
           <w:sz w:val="22"/>
         </w:rPr>
-        <w:t xml:space="preserve">☑  </w:t>
+        <w:t xml:space="preserve">✔  </w:t>
       </w:r>
       <w:r>
         <w:rPr>
+          <w:rFonts w:ascii="Helvetica Neue" w:hAnsi="Helvetica Neue"/>
           <w:color w:val="3A3A3A"/>
-          <w:sz w:val="21"/>
+          <w:sz w:val="20"/>
         </w:rPr>
-        <w:t>Decision Intelligence Layer / Platform to Coordination Infrastructure</w:t>
+        <w:t>Decision Intelligence Layer / Platform → Coordination Infrastructure</w:t>
       </w:r>
     </w:p>
     <w:p>
       <w:pPr>
-        <w:spacing w:after="60"/>
-        <w:ind w:left="360"/>
+        <w:spacing w:after="40"/>
+        <w:ind w:left="216"/>
       </w:pPr>
       <w:r>
         <w:rPr>
+          <w:rFonts w:ascii="Helvetica Neue" w:hAnsi="Helvetica Neue"/>
           <w:b/>
-          <w:color w:val="E95704"/>
+          <w:color w:val="16A34A"/>
           <w:sz w:val="22"/>
         </w:rPr>
-        <w:t xml:space="preserve">☑  </w:t>
+        <w:t xml:space="preserve">✔  </w:t>
       </w:r>
       <w:r>
         <w:rPr>
+          <w:rFonts w:ascii="Helvetica Neue" w:hAnsi="Helvetica Neue"/>
           <w:color w:val="3A3A3A"/>
-          <w:sz w:val="21"/>
+          <w:sz w:val="20"/>
         </w:rPr>
-        <w:t>Newsletter footer: "decision intelligence delivered monthly" to "enterprise insights delivered monthly"</w:t>
+        <w:t>Newsletter footer line updated to TwoSuns framing</w:t>
       </w:r>
     </w:p>
     <w:p>
       <w:pPr>
-        <w:spacing w:before="240" w:after="80"/>
+        <w:spacing w:before="200" w:after="80"/>
       </w:pPr>
       <w:r>
         <w:rPr>
+          <w:rFonts w:ascii="Helvetica Neue" w:hAnsi="Helvetica Neue"/>
           <w:b/>
           <w:color w:val="E95704"/>
-          <w:sz w:val="26"/>
+          <w:sz w:val="23"/>
         </w:rPr>
-        <w:t>A3. Homepage hero rewrite</w:t>
+        <w:t>A3 · Homepage hero rewrite</w:t>
       </w:r>
     </w:p>
     <w:p>
       <w:pPr>
-        <w:spacing w:after="60"/>
-        <w:ind w:left="360"/>
+        <w:spacing w:after="40"/>
+        <w:ind w:left="216"/>
       </w:pPr>
       <w:r>
         <w:rPr>
+          <w:rFonts w:ascii="Helvetica Neue" w:hAnsi="Helvetica Neue"/>
           <w:b/>
-          <w:color w:val="E95704"/>
+          <w:color w:val="16A34A"/>
           <w:sz w:val="22"/>
         </w:rPr>
-        <w:t xml:space="preserve">☑  </w:t>
+        <w:t xml:space="preserve">✔  </w:t>
       </w:r>
       <w:r>
         <w:rPr>
+          <w:rFonts w:ascii="Helvetica Neue" w:hAnsi="Helvetica Neue"/>
           <w:color w:val="3A3A3A"/>
-          <w:sz w:val="21"/>
+          <w:sz w:val="20"/>
         </w:rPr>
         <w:t>Eyebrow: Coordination Infrastructure for the Enterprise</w:t>
       </w:r>
     </w:p>
     <w:p>
       <w:pPr>
-        <w:spacing w:after="60"/>
-        <w:ind w:left="360"/>
+        <w:spacing w:after="40"/>
+        <w:ind w:left="216"/>
       </w:pPr>
       <w:r>
         <w:rPr>
+          <w:rFonts w:ascii="Helvetica Neue" w:hAnsi="Helvetica Neue"/>
           <w:b/>
-          <w:color w:val="E95704"/>
+          <w:color w:val="16A34A"/>
           <w:sz w:val="22"/>
         </w:rPr>
-        <w:t xml:space="preserve">☑  </w:t>
+        <w:t xml:space="preserve">✔  </w:t>
       </w:r>
       <w:r>
         <w:rPr>
+          <w:rFonts w:ascii="Helvetica Neue" w:hAnsi="Helvetica Neue"/>
           <w:color w:val="3A3A3A"/>
-          <w:sz w:val="21"/>
+          <w:sz w:val="20"/>
         </w:rPr>
         <w:t>Headline: Coordination Infrastructure for Complex Enterprises</w:t>
       </w:r>
     </w:p>
     <w:p>
       <w:pPr>
-        <w:spacing w:after="60"/>
-        <w:ind w:left="360"/>
+        <w:spacing w:after="40"/>
+        <w:ind w:left="216"/>
       </w:pPr>
       <w:r>
         <w:rPr>
+          <w:rFonts w:ascii="Helvetica Neue" w:hAnsi="Helvetica Neue"/>
           <w:b/>
-          <w:color w:val="E95704"/>
+          <w:color w:val="16A34A"/>
           <w:sz w:val="22"/>
         </w:rPr>
-        <w:t xml:space="preserve">☑  </w:t>
+        <w:t xml:space="preserve">✔  </w:t>
       </w:r>
       <w:r>
         <w:rPr>
+          <w:rFonts w:ascii="Helvetica Neue" w:hAnsi="Helvetica Neue"/>
           <w:color w:val="3A3A3A"/>
-          <w:sz w:val="21"/>
+          <w:sz w:val="20"/>
         </w:rPr>
         <w:t>Tagline: Coordinate. Execute. Continue.</w:t>
       </w:r>
     </w:p>
     <w:p>
       <w:pPr>
-        <w:spacing w:after="60"/>
-        <w:ind w:left="360"/>
+        <w:spacing w:after="40"/>
+        <w:ind w:left="216"/>
       </w:pPr>
       <w:r>
         <w:rPr>
+          <w:rFonts w:ascii="Helvetica Neue" w:hAnsi="Helvetica Neue"/>
           <w:b/>
-          <w:color w:val="E95704"/>
+          <w:color w:val="16A34A"/>
           <w:sz w:val="22"/>
         </w:rPr>
-        <w:t xml:space="preserve">☑  </w:t>
+        <w:t xml:space="preserve">✔  </w:t>
       </w:r>
       <w:r>
         <w:rPr>
+          <w:rFonts w:ascii="Helvetica Neue" w:hAnsi="Helvetica Neue"/>
           <w:color w:val="3A3A3A"/>
-          <w:sz w:val="21"/>
+          <w:sz w:val="20"/>
         </w:rPr>
         <w:t>Subhead and body rewritten per TwoSuns brief</w:t>
       </w:r>
     </w:p>
     <w:p>
       <w:pPr>
-        <w:spacing w:after="60"/>
-        <w:ind w:left="360"/>
+        <w:spacing w:after="40"/>
+        <w:ind w:left="216"/>
       </w:pPr>
       <w:r>
         <w:rPr>
+          <w:rFonts w:ascii="Helvetica Neue" w:hAnsi="Helvetica Neue"/>
           <w:b/>
-          <w:color w:val="E95704"/>
+          <w:color w:val="16A34A"/>
           <w:sz w:val="22"/>
         </w:rPr>
-        <w:t xml:space="preserve">☑  </w:t>
+        <w:t xml:space="preserve">✔  </w:t>
       </w:r>
       <w:r>
         <w:rPr>
+          <w:rFonts w:ascii="Helvetica Neue" w:hAnsi="Helvetica Neue"/>
           <w:color w:val="3A3A3A"/>
-          <w:sz w:val="21"/>
+          <w:sz w:val="20"/>
         </w:rPr>
-        <w:t>CTAs: Request a Discovery Session / Explore the Platform</w:t>
+        <w:t>CTAs: Request a Discovery Session  ·  Explore the Platform</w:t>
       </w:r>
     </w:p>
     <w:p>
       <w:pPr>
-        <w:spacing w:after="60"/>
-        <w:ind w:left="360"/>
+        <w:spacing w:after="40"/>
+        <w:ind w:left="216"/>
       </w:pPr>
       <w:r>
         <w:rPr>
+          <w:rFonts w:ascii="Helvetica Neue" w:hAnsi="Helvetica Neue"/>
           <w:b/>
-          <w:color w:val="E95704"/>
+          <w:color w:val="16A34A"/>
           <w:sz w:val="22"/>
         </w:rPr>
-        <w:t xml:space="preserve">☑  </w:t>
+        <w:t xml:space="preserve">✔  </w:t>
       </w:r>
       <w:r>
         <w:rPr>
+          <w:rFonts w:ascii="Helvetica Neue" w:hAnsi="Helvetica Neue"/>
           <w:color w:val="3A3A3A"/>
-          <w:sz w:val="21"/>
+          <w:sz w:val="20"/>
         </w:rPr>
-        <w:t>Sun centerpiece: Powering Decisions to Coordinating Execution</w:t>
+        <w:t>Sun centerpiece: Powering Decisions → Coordinating Execution</w:t>
       </w:r>
     </w:p>
     <w:p>
       <w:pPr>
-        <w:spacing w:after="60"/>
-        <w:ind w:left="360"/>
+        <w:spacing w:after="40"/>
+        <w:ind w:left="216"/>
       </w:pPr>
       <w:r>
         <w:rPr>
+          <w:rFonts w:ascii="Helvetica Neue" w:hAnsi="Helvetica Neue"/>
           <w:b/>
-          <w:color w:val="E95704"/>
+          <w:color w:val="16A34A"/>
           <w:sz w:val="22"/>
         </w:rPr>
-        <w:t xml:space="preserve">☑  </w:t>
+        <w:t xml:space="preserve">✔  </w:t>
       </w:r>
       <w:r>
         <w:rPr>
+          <w:rFonts w:ascii="Helvetica Neue" w:hAnsi="Helvetica Neue"/>
           <w:color w:val="3A3A3A"/>
-          <w:sz w:val="21"/>
+          <w:sz w:val="20"/>
         </w:rPr>
         <w:t>Hero chips: Supply Chain Risk, Cyber Risk, Compliance Review, Geopolitical Risk</w:t>
       </w:r>
     </w:p>
     <w:p>
       <w:pPr>
-        <w:spacing w:before="240" w:after="80"/>
+        <w:spacing w:before="200" w:after="80"/>
       </w:pPr>
       <w:r>
         <w:rPr>
+          <w:rFonts w:ascii="Helvetica Neue" w:hAnsi="Helvetica Neue"/>
           <w:b/>
           <w:color w:val="E95704"/>
-          <w:sz w:val="26"/>
+          <w:sz w:val="23"/>
         </w:rPr>
-        <w:t>A4. Earlier session work (also live)</w:t>
+        <w:t>A4 · Earlier session work (also live)</w:t>
       </w:r>
     </w:p>
     <w:p>
       <w:pPr>
-        <w:spacing w:after="60"/>
-        <w:ind w:left="360"/>
+        <w:spacing w:after="40"/>
+        <w:ind w:left="216"/>
       </w:pPr>
       <w:r>
         <w:rPr>
+          <w:rFonts w:ascii="Helvetica Neue" w:hAnsi="Helvetica Neue"/>
           <w:b/>
-          <w:color w:val="E95704"/>
+          <w:color w:val="16A34A"/>
           <w:sz w:val="22"/>
         </w:rPr>
-        <w:t xml:space="preserve">☑  </w:t>
+        <w:t xml:space="preserve">✔  </w:t>
       </w:r>
       <w:r>
         <w:rPr>
+          <w:rFonts w:ascii="Helvetica Neue" w:hAnsi="Helvetica Neue"/>
           <w:color w:val="3A3A3A"/>
-          <w:sz w:val="21"/>
+          <w:sz w:val="20"/>
         </w:rPr>
         <w:t>Belén bio update per her April email markup</w:t>
       </w:r>
     </w:p>
     <w:p>
       <w:pPr>
-        <w:spacing w:after="60"/>
-        <w:ind w:left="360"/>
+        <w:spacing w:after="40"/>
+        <w:ind w:left="216"/>
       </w:pPr>
       <w:r>
         <w:rPr>
+          <w:rFonts w:ascii="Helvetica Neue" w:hAnsi="Helvetica Neue"/>
           <w:b/>
-          <w:color w:val="E95704"/>
+          <w:color w:val="16A34A"/>
           <w:sz w:val="22"/>
         </w:rPr>
-        <w:t xml:space="preserve">☑  </w:t>
+        <w:t xml:space="preserve">✔  </w:t>
       </w:r>
       <w:r>
         <w:rPr>
+          <w:rFonts w:ascii="Helvetica Neue" w:hAnsi="Helvetica Neue"/>
           <w:color w:val="3A3A3A"/>
-          <w:sz w:val="21"/>
+          <w:sz w:val="20"/>
         </w:rPr>
         <w:t>Em dash removal site-wide (CEO rule)</w:t>
       </w:r>
     </w:p>
     <w:p>
       <w:pPr>
-        <w:spacing w:after="60"/>
-        <w:ind w:left="360"/>
+        <w:spacing w:after="40"/>
+        <w:ind w:left="216"/>
       </w:pPr>
       <w:r>
         <w:rPr>
+          <w:rFonts w:ascii="Helvetica Neue" w:hAnsi="Helvetica Neue"/>
           <w:b/>
-          <w:color w:val="E95704"/>
+          <w:color w:val="16A34A"/>
           <w:sz w:val="22"/>
         </w:rPr>
-        <w:t xml:space="preserve">☑  </w:t>
+        <w:t xml:space="preserve">✔  </w:t>
       </w:r>
       <w:r>
         <w:rPr>
+          <w:rFonts w:ascii="Helvetica Neue" w:hAnsi="Helvetica Neue"/>
           <w:color w:val="3A3A3A"/>
-          <w:sz w:val="21"/>
+          <w:sz w:val="20"/>
         </w:rPr>
         <w:t>in real time / real-time replaced with continuously / continuous</w:t>
       </w:r>
     </w:p>
     <w:p>
       <w:pPr>
-        <w:spacing w:after="60"/>
-        <w:ind w:left="360"/>
+        <w:spacing w:after="40"/>
+        <w:ind w:left="216"/>
       </w:pPr>
       <w:r>
         <w:rPr>
+          <w:rFonts w:ascii="Helvetica Neue" w:hAnsi="Helvetica Neue"/>
           <w:b/>
-          <w:color w:val="E95704"/>
+          <w:color w:val="16A34A"/>
           <w:sz w:val="22"/>
         </w:rPr>
-        <w:t xml:space="preserve">☑  </w:t>
+        <w:t xml:space="preserve">✔  </w:t>
       </w:r>
       <w:r>
         <w:rPr>
+          <w:rFonts w:ascii="Helvetica Neue" w:hAnsi="Helvetica Neue"/>
           <w:color w:val="3A3A3A"/>
-          <w:sz w:val="21"/>
+          <w:sz w:val="20"/>
         </w:rPr>
         <w:t>Credibility tweaks (Cutting-Edge, best-in-class, move faster)</w:t>
       </w:r>
     </w:p>
     <w:p>
       <w:pPr>
-        <w:spacing w:after="60"/>
-        <w:ind w:left="360"/>
+        <w:spacing w:after="40"/>
+        <w:ind w:left="216"/>
       </w:pPr>
       <w:r>
         <w:rPr>
+          <w:rFonts w:ascii="Helvetica Neue" w:hAnsi="Helvetica Neue"/>
           <w:b/>
-          <w:color w:val="E95704"/>
+          <w:color w:val="16A34A"/>
           <w:sz w:val="22"/>
         </w:rPr>
-        <w:t xml:space="preserve">☑  </w:t>
+        <w:t xml:space="preserve">✔  </w:t>
       </w:r>
       <w:r>
         <w:rPr>
+          <w:rFonts w:ascii="Helvetica Neue" w:hAnsi="Helvetica Neue"/>
           <w:color w:val="3A3A3A"/>
-          <w:sz w:val="21"/>
+          <w:sz w:val="20"/>
         </w:rPr>
         <w:t>Photo background darkening (Aiman, Belén, Michelle; Ryan kept original)</w:t>
       </w:r>
     </w:p>
     <w:p>
       <w:pPr>
-        <w:spacing w:after="60"/>
-        <w:ind w:left="360"/>
+        <w:spacing w:after="40"/>
+        <w:ind w:left="216"/>
       </w:pPr>
       <w:r>
         <w:rPr>
+          <w:rFonts w:ascii="Helvetica Neue" w:hAnsi="Helvetica Neue"/>
           <w:b/>
-          <w:color w:val="E95704"/>
+          <w:color w:val="16A34A"/>
           <w:sz w:val="22"/>
         </w:rPr>
-        <w:t xml:space="preserve">☑  </w:t>
+        <w:t xml:space="preserve">✔  </w:t>
       </w:r>
       <w:r>
         <w:rPr>
+          <w:rFonts w:ascii="Helvetica Neue" w:hAnsi="Helvetica Neue"/>
           <w:color w:val="3A3A3A"/>
-          <w:sz w:val="21"/>
+          <w:sz w:val="20"/>
         </w:rPr>
         <w:t>Site-wide nav logo swap to horizontal variant at 60px</w:t>
       </w:r>
     </w:p>
     <w:p>
       <w:pPr>
-        <w:spacing w:before="240" w:after="80"/>
+        <w:spacing w:before="200" w:after="80"/>
       </w:pPr>
       <w:r>
         <w:rPr>
+          <w:rFonts w:ascii="Helvetica Neue" w:hAnsi="Helvetica Neue"/>
           <w:b/>
           <w:color w:val="E95704"/>
-          <w:sz w:val="26"/>
+          <w:sz w:val="23"/>
         </w:rPr>
-        <w:t>A5. Backup</w:t>
+        <w:t>A5 · Backup</w:t>
       </w:r>
     </w:p>
     <w:p>
       <w:pPr>
-        <w:spacing w:after="60"/>
-        <w:ind w:left="360"/>
+        <w:spacing w:after="40"/>
+        <w:ind w:left="216"/>
       </w:pPr>
       <w:r>
         <w:rPr>
+          <w:rFonts w:ascii="Helvetica Neue" w:hAnsi="Helvetica Neue"/>
           <w:b/>
-          <w:color w:val="E95704"/>
+          <w:color w:val="16A34A"/>
           <w:sz w:val="22"/>
         </w:rPr>
-        <w:t xml:space="preserve">☑  </w:t>
+        <w:t xml:space="preserve">✔  </w:t>
       </w:r>
       <w:r>
         <w:rPr>
+          <w:rFonts w:ascii="Helvetica Neue" w:hAnsi="Helvetica Neue"/>
           <w:color w:val="3A3A3A"/>
-          <w:sz w:val="21"/>
+          <w:sz w:val="20"/>
         </w:rPr>
         <w:t>Pre-rebrand snapshot at nexsun-backup-pre-twosuns-2026-04-30/ (87MB, full repo with git history)</w:t>
       </w:r>
     </w:p>
     <w:p>
       <w:pPr>
-        <w:spacing w:before="240" w:after="240"/>
+        <w:spacing w:before="160" w:after="160"/>
+        <w:pBdr>
+          <w:bottom w:val="single" w:sz="8" w:space="1" w:color="E5E7EB"/>
+        </w:pBdr>
       </w:pPr>
-      <w:r>
-        <w:rPr>
-          <w:color w:val="CCCCCC"/>
-          <w:sz w:val="16"/>
-        </w:rPr>
-        <w:t>______________________________________________________________________</w:t>
-      </w:r>
     </w:p>
-    <w:p>
-      <w:pPr>
-        <w:spacing w:before="400" w:after="120"/>
-      </w:pPr>
-      <w:r>
-        <w:rPr>
-          <w:b/>
-          <w:color w:val="E95704"/>
-          <w:sz w:val="36"/>
-        </w:rPr>
-        <w:t>B. Pending: per-page content polish</w:t>
-      </w:r>
-    </w:p>
+    <w:tbl>
+      <w:tblPr>
+        <w:tblW w:type="auto" w:w="0"/>
+        <w:jc w:val="left"/>
+        <w:tblLook w:firstColumn="1" w:firstRow="1" w:lastColumn="0" w:lastRow="0" w:noHBand="0" w:noVBand="1" w:val="04A0"/>
+      </w:tblPr>
+      <w:tblGrid>
+        <w:gridCol w:w="9648"/>
+      </w:tblGrid>
+      <w:tr>
+        <w:tc>
+          <w:tcPr>
+            <w:tcW w:type="dxa" w:w="9648"/>
+            <w:shd w:val="clear" w:color="auto" w:fill="163E64"/>
+            <w:tcBorders>
+              <w:top w:val="nil"/>
+              <w:left w:val="nil"/>
+              <w:bottom w:val="nil"/>
+              <w:right w:val="nil"/>
+            </w:tcBorders>
+            <w:vAlign w:val="center"/>
+          </w:tcPr>
+          <w:p>
+            <w:pPr>
+              <w:spacing w:before="40" w:after="40"/>
+              <w:ind w:left="259"/>
+            </w:pPr>
+            <w:r>
+              <w:rPr>
+                <w:rFonts w:ascii="Helvetica Neue" w:hAnsi="Helvetica Neue"/>
+                <w:b/>
+                <w:color w:val="F6B707"/>
+                <w:sz w:val="40"/>
+              </w:rPr>
+              <w:t xml:space="preserve"> B  </w:t>
+            </w:r>
+            <w:r>
+              <w:rPr>
+                <w:rFonts w:ascii="Helvetica Neue" w:hAnsi="Helvetica Neue"/>
+                <w:b/>
+                <w:color w:val="FFFFFF"/>
+                <w:sz w:val="30"/>
+              </w:rPr>
+              <w:t>Pending: per-page content polish</w:t>
+            </w:r>
+            <w:r>
+              <w:rPr>
+                <w:rFonts w:ascii="Helvetica Neue" w:hAnsi="Helvetica Neue"/>
+                <w:color w:val="F6B707"/>
+                <w:sz w:val="20"/>
+              </w:rPr>
+              <w:t xml:space="preserve">   0/28 done</w:t>
+            </w:r>
+          </w:p>
+        </w:tc>
+      </w:tr>
+    </w:tbl>
     <w:p>
       <w:pPr>
         <w:spacing w:after="120"/>
       </w:pPr>
+    </w:p>
+    <w:p>
+      <w:pPr>
+        <w:spacing w:after="200"/>
+      </w:pPr>
       <w:r>
         <w:rPr>
+          <w:rFonts w:ascii="Helvetica Neue" w:hAnsi="Helvetica Neue"/>
+          <w:b w:val="0"/>
           <w:i/>
-          <w:color w:val="3A3A3A"/>
+          <w:color w:val="64748B"/>
           <w:sz w:val="21"/>
         </w:rPr>
         <w:t>These pages had brand and terminology auto-replaced, but body copy still leans Nexsun-era. Each needs a focused content pass referencing the TwoSuns Web Content doc.</w:t>
@@ -741,24 +1275,26 @@
     </w:p>
     <w:p>
       <w:pPr>
-        <w:spacing w:before="240" w:after="80"/>
+        <w:spacing w:before="200" w:after="80"/>
       </w:pPr>
       <w:r>
         <w:rPr>
+          <w:rFonts w:ascii="Helvetica Neue" w:hAnsi="Helvetica Neue"/>
           <w:b/>
           <w:color w:val="E95704"/>
-          <w:sz w:val="26"/>
+          <w:sz w:val="23"/>
         </w:rPr>
-        <w:t>B1. Core pages</w:t>
+        <w:t>B1 · Core pages</w:t>
       </w:r>
     </w:p>
     <w:p>
       <w:pPr>
-        <w:spacing w:after="60"/>
-        <w:ind w:left="360"/>
+        <w:spacing w:after="40"/>
+        <w:ind w:left="216"/>
       </w:pPr>
       <w:r>
         <w:rPr>
+          <w:rFonts w:ascii="Helvetica Neue" w:hAnsi="Helvetica Neue"/>
           <w:b/>
           <w:color w:val="163E64"/>
           <w:sz w:val="22"/>
@@ -767,19 +1303,21 @@
       </w:r>
       <w:r>
         <w:rPr>
+          <w:rFonts w:ascii="Helvetica Neue" w:hAnsi="Helvetica Neue"/>
           <w:color w:val="3A3A3A"/>
-          <w:sz w:val="21"/>
+          <w:sz w:val="20"/>
         </w:rPr>
-        <w:t>index.html, sections beyond hero (Positioning, Mission/Vision, Challenge/Opportunity, Modules at a Glance, Decision Packs/Picks, Engagement Model, Industries grid)</w:t>
+        <w:t>index.html sections beyond hero (Positioning, Mission/Vision, Challenge/Opportunity, Modules, Decision Packs, Engagement Model, Industries)</w:t>
       </w:r>
     </w:p>
     <w:p>
       <w:pPr>
-        <w:spacing w:after="60"/>
-        <w:ind w:left="360"/>
+        <w:spacing w:after="40"/>
+        <w:ind w:left="216"/>
       </w:pPr>
       <w:r>
         <w:rPr>
+          <w:rFonts w:ascii="Helvetica Neue" w:hAnsi="Helvetica Neue"/>
           <w:b/>
           <w:color w:val="163E64"/>
           <w:sz w:val="22"/>
@@ -788,19 +1326,21 @@
       </w:r>
       <w:r>
         <w:rPr>
+          <w:rFonts w:ascii="Helvetica Neue" w:hAnsi="Helvetica Neue"/>
           <w:color w:val="3A3A3A"/>
-          <w:sz w:val="21"/>
+          <w:sz w:val="20"/>
         </w:rPr>
-        <w:t>platform.html, full rewrite. Currently still describes Energy Triad and decision intelligence modules</w:t>
+        <w:t>platform.html: full rewrite. Still describes Energy Triad and decision intelligence modules</w:t>
       </w:r>
     </w:p>
     <w:p>
       <w:pPr>
-        <w:spacing w:after="60"/>
-        <w:ind w:left="360"/>
+        <w:spacing w:after="40"/>
+        <w:ind w:left="216"/>
       </w:pPr>
       <w:r>
         <w:rPr>
+          <w:rFonts w:ascii="Helvetica Neue" w:hAnsi="Helvetica Neue"/>
           <w:b/>
           <w:color w:val="163E64"/>
           <w:sz w:val="22"/>
@@ -809,19 +1349,21 @@
       </w:r>
       <w:r>
         <w:rPr>
+          <w:rFonts w:ascii="Helvetica Neue" w:hAnsi="Helvetica Neue"/>
           <w:color w:val="3A3A3A"/>
-          <w:sz w:val="21"/>
+          <w:sz w:val="20"/>
         </w:rPr>
-        <w:t>about.html, founder bios, Built by Operators, Operating Model. Quotes still in Nexsun voice</w:t>
+        <w:t>about.html: founder bios, Built by Operators, Operating Model. Quotes still in Nexsun voice</w:t>
       </w:r>
     </w:p>
     <w:p>
       <w:pPr>
-        <w:spacing w:after="60"/>
-        <w:ind w:left="360"/>
+        <w:spacing w:after="40"/>
+        <w:ind w:left="216"/>
       </w:pPr>
       <w:r>
         <w:rPr>
+          <w:rFonts w:ascii="Helvetica Neue" w:hAnsi="Helvetica Neue"/>
           <w:b/>
           <w:color w:val="163E64"/>
           <w:sz w:val="22"/>
@@ -830,19 +1372,21 @@
       </w:r>
       <w:r>
         <w:rPr>
+          <w:rFonts w:ascii="Helvetica Neue" w:hAnsi="Helvetica Neue"/>
           <w:color w:val="3A3A3A"/>
-          <w:sz w:val="21"/>
+          <w:sz w:val="20"/>
         </w:rPr>
-        <w:t>why-nexsun.html, structural rewrite. Filename also needs rename to why-twosuns.html</w:t>
+        <w:t>why-nexsun.html: structural rewrite. Filename also needs rename to why-twosuns.html</w:t>
       </w:r>
     </w:p>
     <w:p>
       <w:pPr>
-        <w:spacing w:after="60"/>
-        <w:ind w:left="360"/>
+        <w:spacing w:after="40"/>
+        <w:ind w:left="216"/>
       </w:pPr>
       <w:r>
         <w:rPr>
+          <w:rFonts w:ascii="Helvetica Neue" w:hAnsi="Helvetica Neue"/>
           <w:b/>
           <w:color w:val="163E64"/>
           <w:sz w:val="22"/>
@@ -851,19 +1395,21 @@
       </w:r>
       <w:r>
         <w:rPr>
+          <w:rFonts w:ascii="Helvetica Neue" w:hAnsi="Helvetica Neue"/>
           <w:color w:val="3A3A3A"/>
-          <w:sz w:val="21"/>
+          <w:sz w:val="20"/>
         </w:rPr>
-        <w:t>how-it-works.html, replace Sense/Analyze/Position/Align/Commit/Record with TwoSuns coordination model</w:t>
+        <w:t>how-it-works.html: replace Sense/Analyze/Position/Align/Commit/Record lifecycle with TwoSuns coordination model</w:t>
       </w:r>
     </w:p>
     <w:p>
       <w:pPr>
-        <w:spacing w:after="60"/>
-        <w:ind w:left="360"/>
+        <w:spacing w:after="40"/>
+        <w:ind w:left="216"/>
       </w:pPr>
       <w:r>
         <w:rPr>
+          <w:rFonts w:ascii="Helvetica Neue" w:hAnsi="Helvetica Neue"/>
           <w:b/>
           <w:color w:val="163E64"/>
           <w:sz w:val="22"/>
@@ -872,19 +1418,21 @@
       </w:r>
       <w:r>
         <w:rPr>
+          <w:rFonts w:ascii="Helvetica Neue" w:hAnsi="Helvetica Neue"/>
           <w:color w:val="3A3A3A"/>
-          <w:sz w:val="21"/>
+          <w:sz w:val="20"/>
         </w:rPr>
-        <w:t>applications.html, 5 sections built around Decision Intelligence. Reframe around Horizon/Forge/Core</w:t>
+        <w:t>applications.html: 5 sections built around Decision Intelligence. Reframe around Horizon/Forge/Core</w:t>
       </w:r>
     </w:p>
     <w:p>
       <w:pPr>
-        <w:spacing w:after="60"/>
-        <w:ind w:left="360"/>
+        <w:spacing w:after="40"/>
+        <w:ind w:left="216"/>
       </w:pPr>
       <w:r>
         <w:rPr>
+          <w:rFonts w:ascii="Helvetica Neue" w:hAnsi="Helvetica Neue"/>
           <w:b/>
           <w:color w:val="163E64"/>
           <w:sz w:val="22"/>
@@ -893,32 +1441,35 @@
       </w:r>
       <w:r>
         <w:rPr>
+          <w:rFonts w:ascii="Helvetica Neue" w:hAnsi="Helvetica Neue"/>
           <w:color w:val="3A3A3A"/>
-          <w:sz w:val="21"/>
+          <w:sz w:val="20"/>
         </w:rPr>
-        <w:t>engage.html, structured pilots messaging. Update to TwoSuns 4-phase engagement model</w:t>
+        <w:t>engage.html: structured pilots messaging. Update to TwoSuns 4-phase engagement</w:t>
       </w:r>
     </w:p>
     <w:p>
       <w:pPr>
-        <w:spacing w:before="240" w:after="80"/>
+        <w:spacing w:before="200" w:after="80"/>
       </w:pPr>
       <w:r>
         <w:rPr>
+          <w:rFonts w:ascii="Helvetica Neue" w:hAnsi="Helvetica Neue"/>
           <w:b/>
           <w:color w:val="E95704"/>
-          <w:sz w:val="26"/>
+          <w:sz w:val="23"/>
         </w:rPr>
-        <w:t>B2. Supporting pages</w:t>
+        <w:t>B2 · Supporting pages</w:t>
       </w:r>
     </w:p>
     <w:p>
       <w:pPr>
-        <w:spacing w:after="60"/>
-        <w:ind w:left="360"/>
+        <w:spacing w:after="40"/>
+        <w:ind w:left="216"/>
       </w:pPr>
       <w:r>
         <w:rPr>
+          <w:rFonts w:ascii="Helvetica Neue" w:hAnsi="Helvetica Neue"/>
           <w:b/>
           <w:color w:val="163E64"/>
           <w:sz w:val="22"/>
@@ -927,19 +1478,21 @@
       </w:r>
       <w:r>
         <w:rPr>
+          <w:rFonts w:ascii="Helvetica Neue" w:hAnsi="Helvetica Neue"/>
           <w:color w:val="3A3A3A"/>
-          <w:sz w:val="21"/>
+          <w:sz w:val="20"/>
         </w:rPr>
-        <w:t>modules.html, rebuild around Horizon, Forge, Core</w:t>
+        <w:t>modules.html: rebuild around Horizon, Forge, Core</w:t>
       </w:r>
     </w:p>
     <w:p>
       <w:pPr>
-        <w:spacing w:after="60"/>
-        <w:ind w:left="360"/>
+        <w:spacing w:after="40"/>
+        <w:ind w:left="216"/>
       </w:pPr>
       <w:r>
         <w:rPr>
+          <w:rFonts w:ascii="Helvetica Neue" w:hAnsi="Helvetica Neue"/>
           <w:b/>
           <w:color w:val="163E64"/>
           <w:sz w:val="22"/>
@@ -948,19 +1501,21 @@
       </w:r>
       <w:r>
         <w:rPr>
+          <w:rFonts w:ascii="Helvetica Neue" w:hAnsi="Helvetica Neue"/>
           <w:color w:val="3A3A3A"/>
-          <w:sz w:val="21"/>
+          <w:sz w:val="20"/>
         </w:rPr>
-        <w:t>technology.html, update from Nexsun stack to TwoSuns architecture</w:t>
+        <w:t>technology.html: update from Nexsun stack to TwoSuns architecture</w:t>
       </w:r>
     </w:p>
     <w:p>
       <w:pPr>
-        <w:spacing w:after="60"/>
-        <w:ind w:left="360"/>
+        <w:spacing w:after="40"/>
+        <w:ind w:left="216"/>
       </w:pPr>
       <w:r>
         <w:rPr>
+          <w:rFonts w:ascii="Helvetica Neue" w:hAnsi="Helvetica Neue"/>
           <w:b/>
           <w:color w:val="163E64"/>
           <w:sz w:val="22"/>
@@ -969,19 +1524,21 @@
       </w:r>
       <w:r>
         <w:rPr>
+          <w:rFonts w:ascii="Helvetica Neue" w:hAnsi="Helvetica Neue"/>
           <w:color w:val="3A3A3A"/>
-          <w:sz w:val="21"/>
+          <w:sz w:val="20"/>
         </w:rPr>
-        <w:t>investors.html, What TwoSuns Owns section, pitch-deck content</w:t>
+        <w:t>investors.html: What TwoSuns Owns section, pitch-deck content</w:t>
       </w:r>
     </w:p>
     <w:p>
       <w:pPr>
-        <w:spacing w:after="60"/>
-        <w:ind w:left="360"/>
+        <w:spacing w:after="40"/>
+        <w:ind w:left="216"/>
       </w:pPr>
       <w:r>
         <w:rPr>
+          <w:rFonts w:ascii="Helvetica Neue" w:hAnsi="Helvetica Neue"/>
           <w:b/>
           <w:color w:val="163E64"/>
           <w:sz w:val="22"/>
@@ -990,19 +1547,21 @@
       </w:r>
       <w:r>
         <w:rPr>
+          <w:rFonts w:ascii="Helvetica Neue" w:hAnsi="Helvetica Neue"/>
           <w:color w:val="3A3A3A"/>
-          <w:sz w:val="21"/>
+          <w:sz w:val="20"/>
         </w:rPr>
-        <w:t>partners.html, partner program tiers</w:t>
+        <w:t>partners.html: partner program tiers</w:t>
       </w:r>
     </w:p>
     <w:p>
       <w:pPr>
-        <w:spacing w:after="60"/>
-        <w:ind w:left="360"/>
+        <w:spacing w:after="40"/>
+        <w:ind w:left="216"/>
       </w:pPr>
       <w:r>
         <w:rPr>
+          <w:rFonts w:ascii="Helvetica Neue" w:hAnsi="Helvetica Neue"/>
           <w:b/>
           <w:color w:val="163E64"/>
           <w:sz w:val="22"/>
@@ -1011,19 +1570,21 @@
       </w:r>
       <w:r>
         <w:rPr>
+          <w:rFonts w:ascii="Helvetica Neue" w:hAnsi="Helvetica Neue"/>
           <w:color w:val="3A3A3A"/>
-          <w:sz w:val="21"/>
+          <w:sz w:val="20"/>
         </w:rPr>
-        <w:t>trust.html, security and governance language</w:t>
+        <w:t>trust.html: security and governance language</w:t>
       </w:r>
     </w:p>
     <w:p>
       <w:pPr>
-        <w:spacing w:after="60"/>
-        <w:ind w:left="360"/>
+        <w:spacing w:after="40"/>
+        <w:ind w:left="216"/>
       </w:pPr>
       <w:r>
         <w:rPr>
+          <w:rFonts w:ascii="Helvetica Neue" w:hAnsi="Helvetica Neue"/>
           <w:b/>
           <w:color w:val="163E64"/>
           <w:sz w:val="22"/>
@@ -1032,19 +1593,21 @@
       </w:r>
       <w:r>
         <w:rPr>
+          <w:rFonts w:ascii="Helvetica Neue" w:hAnsi="Helvetica Neue"/>
           <w:color w:val="3A3A3A"/>
-          <w:sz w:val="21"/>
+          <w:sz w:val="20"/>
         </w:rPr>
-        <w:t>contact.html, departmental email addresses</w:t>
+        <w:t>contact.html: departmental email addresses</w:t>
       </w:r>
     </w:p>
     <w:p>
       <w:pPr>
-        <w:spacing w:after="60"/>
-        <w:ind w:left="360"/>
+        <w:spacing w:after="40"/>
+        <w:ind w:left="216"/>
       </w:pPr>
       <w:r>
         <w:rPr>
+          <w:rFonts w:ascii="Helvetica Neue" w:hAnsi="Helvetica Neue"/>
           <w:b/>
           <w:color w:val="163E64"/>
           <w:sz w:val="22"/>
@@ -1053,19 +1616,21 @@
       </w:r>
       <w:r>
         <w:rPr>
+          <w:rFonts w:ascii="Helvetica Neue" w:hAnsi="Helvetica Neue"/>
           <w:color w:val="3A3A3A"/>
-          <w:sz w:val="21"/>
+          <w:sz w:val="20"/>
         </w:rPr>
-        <w:t>press.html, press releases under Nexsun branding need re-dating or archival note</w:t>
+        <w:t>press.html: press releases under Nexsun branding need re-dating or archival note</w:t>
       </w:r>
     </w:p>
     <w:p>
       <w:pPr>
-        <w:spacing w:after="60"/>
-        <w:ind w:left="360"/>
+        <w:spacing w:after="40"/>
+        <w:ind w:left="216"/>
       </w:pPr>
       <w:r>
         <w:rPr>
+          <w:rFonts w:ascii="Helvetica Neue" w:hAnsi="Helvetica Neue"/>
           <w:b/>
           <w:color w:val="163E64"/>
           <w:sz w:val="22"/>
@@ -1074,19 +1639,21 @@
       </w:r>
       <w:r>
         <w:rPr>
+          <w:rFonts w:ascii="Helvetica Neue" w:hAnsi="Helvetica Neue"/>
           <w:color w:val="3A3A3A"/>
-          <w:sz w:val="21"/>
+          <w:sz w:val="20"/>
         </w:rPr>
-        <w:t>careers.html, Enterprise-Grade AI value cards may need TwoSuns alignment</w:t>
+        <w:t>careers.html: Enterprise-Grade AI value cards may need TwoSuns alignment</w:t>
       </w:r>
     </w:p>
     <w:p>
       <w:pPr>
-        <w:spacing w:after="60"/>
-        <w:ind w:left="360"/>
+        <w:spacing w:after="40"/>
+        <w:ind w:left="216"/>
       </w:pPr>
       <w:r>
         <w:rPr>
+          <w:rFonts w:ascii="Helvetica Neue" w:hAnsi="Helvetica Neue"/>
           <w:b/>
           <w:color w:val="163E64"/>
           <w:sz w:val="22"/>
@@ -1095,19 +1662,21 @@
       </w:r>
       <w:r>
         <w:rPr>
+          <w:rFonts w:ascii="Helvetica Neue" w:hAnsi="Helvetica Neue"/>
           <w:color w:val="3A3A3A"/>
-          <w:sz w:val="21"/>
+          <w:sz w:val="20"/>
         </w:rPr>
-        <w:t>pricing.html, pricing tiers around Decision Packs / Picks</w:t>
+        <w:t>pricing.html: pricing tiers around Decision Packs / Picks</w:t>
       </w:r>
     </w:p>
     <w:p>
       <w:pPr>
-        <w:spacing w:after="60"/>
-        <w:ind w:left="360"/>
+        <w:spacing w:after="40"/>
+        <w:ind w:left="216"/>
       </w:pPr>
       <w:r>
         <w:rPr>
+          <w:rFonts w:ascii="Helvetica Neue" w:hAnsi="Helvetica Neue"/>
           <w:b/>
           <w:color w:val="163E64"/>
           <w:sz w:val="22"/>
@@ -1116,19 +1685,21 @@
       </w:r>
       <w:r>
         <w:rPr>
+          <w:rFonts w:ascii="Helvetica Neue" w:hAnsi="Helvetica Neue"/>
           <w:color w:val="3A3A3A"/>
-          <w:sz w:val="21"/>
+          <w:sz w:val="20"/>
         </w:rPr>
-        <w:t>use-cases.html, 12 use cases under Nexsun framing</w:t>
+        <w:t>use-cases.html: 12 use cases under Nexsun framing</w:t>
       </w:r>
     </w:p>
     <w:p>
       <w:pPr>
-        <w:spacing w:after="60"/>
-        <w:ind w:left="360"/>
+        <w:spacing w:after="40"/>
+        <w:ind w:left="216"/>
       </w:pPr>
       <w:r>
         <w:rPr>
+          <w:rFonts w:ascii="Helvetica Neue" w:hAnsi="Helvetica Neue"/>
           <w:b/>
           <w:color w:val="163E64"/>
           <w:sz w:val="22"/>
@@ -1137,19 +1708,21 @@
       </w:r>
       <w:r>
         <w:rPr>
+          <w:rFonts w:ascii="Helvetica Neue" w:hAnsi="Helvetica Neue"/>
           <w:color w:val="3A3A3A"/>
-          <w:sz w:val="21"/>
+          <w:sz w:val="20"/>
         </w:rPr>
-        <w:t>resources.html, content hub structure</w:t>
+        <w:t>resources.html: content hub structure</w:t>
       </w:r>
     </w:p>
     <w:p>
       <w:pPr>
-        <w:spacing w:after="60"/>
-        <w:ind w:left="360"/>
+        <w:spacing w:after="40"/>
+        <w:ind w:left="216"/>
       </w:pPr>
       <w:r>
         <w:rPr>
+          <w:rFonts w:ascii="Helvetica Neue" w:hAnsi="Helvetica Neue"/>
           <w:b/>
           <w:color w:val="163E64"/>
           <w:sz w:val="22"/>
@@ -1158,19 +1731,21 @@
       </w:r>
       <w:r>
         <w:rPr>
+          <w:rFonts w:ascii="Helvetica Neue" w:hAnsi="Helvetica Neue"/>
           <w:color w:val="3A3A3A"/>
-          <w:sz w:val="21"/>
+          <w:sz w:val="20"/>
         </w:rPr>
-        <w:t>product.html, may consolidate with platform.html</w:t>
+        <w:t>product.html: may consolidate with platform.html</w:t>
       </w:r>
     </w:p>
     <w:p>
       <w:pPr>
-        <w:spacing w:after="60"/>
-        <w:ind w:left="360"/>
+        <w:spacing w:after="40"/>
+        <w:ind w:left="216"/>
       </w:pPr>
       <w:r>
         <w:rPr>
+          <w:rFonts w:ascii="Helvetica Neue" w:hAnsi="Helvetica Neue"/>
           <w:b/>
           <w:color w:val="163E64"/>
           <w:sz w:val="22"/>
@@ -1179,19 +1754,21 @@
       </w:r>
       <w:r>
         <w:rPr>
+          <w:rFonts w:ascii="Helvetica Neue" w:hAnsi="Helvetica Neue"/>
           <w:color w:val="3A3A3A"/>
-          <w:sz w:val="21"/>
+          <w:sz w:val="20"/>
         </w:rPr>
-        <w:t>industries.html, broaden beyond energy/commodities per direction</w:t>
+        <w:t>industries.html: broaden beyond energy/commodities per direction</w:t>
       </w:r>
     </w:p>
     <w:p>
       <w:pPr>
-        <w:spacing w:after="60"/>
-        <w:ind w:left="360"/>
+        <w:spacing w:after="40"/>
+        <w:ind w:left="216"/>
       </w:pPr>
       <w:r>
         <w:rPr>
+          <w:rFonts w:ascii="Helvetica Neue" w:hAnsi="Helvetica Neue"/>
           <w:b/>
           <w:color w:val="163E64"/>
           <w:sz w:val="22"/>
@@ -1200,19 +1777,21 @@
       </w:r>
       <w:r>
         <w:rPr>
+          <w:rFonts w:ascii="Helvetica Neue" w:hAnsi="Helvetica Neue"/>
           <w:color w:val="3A3A3A"/>
-          <w:sz w:val="21"/>
+          <w:sz w:val="20"/>
         </w:rPr>
-        <w:t>book-discovery.html, discovery call landing page</w:t>
+        <w:t>book-discovery.html: discovery call landing page</w:t>
       </w:r>
     </w:p>
     <w:p>
       <w:pPr>
-        <w:spacing w:after="60"/>
-        <w:ind w:left="360"/>
+        <w:spacing w:after="40"/>
+        <w:ind w:left="216"/>
       </w:pPr>
       <w:r>
         <w:rPr>
+          <w:rFonts w:ascii="Helvetica Neue" w:hAnsi="Helvetica Neue"/>
           <w:b/>
           <w:color w:val="163E64"/>
           <w:sz w:val="22"/>
@@ -1221,32 +1800,35 @@
       </w:r>
       <w:r>
         <w:rPr>
+          <w:rFonts w:ascii="Helvetica Neue" w:hAnsi="Helvetica Neue"/>
           <w:color w:val="3A3A3A"/>
-          <w:sz w:val="21"/>
+          <w:sz w:val="20"/>
         </w:rPr>
-        <w:t>solutions-market-intelligence / solutions-contract-analytics / solutions-risk-management, may restructure as Horizon/Forge entries</w:t>
+        <w:t>3 solutions-* pages: restructure as Horizon/Forge entries</w:t>
       </w:r>
     </w:p>
     <w:p>
       <w:pPr>
-        <w:spacing w:before="240" w:after="80"/>
+        <w:spacing w:before="200" w:after="80"/>
       </w:pPr>
       <w:r>
         <w:rPr>
+          <w:rFonts w:ascii="Helvetica Neue" w:hAnsi="Helvetica Neue"/>
           <w:b/>
           <w:color w:val="E95704"/>
-          <w:sz w:val="26"/>
+          <w:sz w:val="23"/>
         </w:rPr>
-        <w:t>B3. Blog and articles</w:t>
+        <w:t>B3 · Blog and articles</w:t>
       </w:r>
     </w:p>
     <w:p>
       <w:pPr>
-        <w:spacing w:after="60"/>
-        <w:ind w:left="360"/>
+        <w:spacing w:after="40"/>
+        <w:ind w:left="216"/>
       </w:pPr>
       <w:r>
         <w:rPr>
+          <w:rFonts w:ascii="Helvetica Neue" w:hAnsi="Helvetica Neue"/>
           <w:b/>
           <w:color w:val="163E64"/>
           <w:sz w:val="22"/>
@@ -1255,19 +1837,21 @@
       </w:r>
       <w:r>
         <w:rPr>
+          <w:rFonts w:ascii="Helvetica Neue" w:hAnsi="Helvetica Neue"/>
           <w:color w:val="3A3A3A"/>
-          <w:sz w:val="21"/>
+          <w:sz w:val="20"/>
         </w:rPr>
         <w:t>11 blog posts under blog/ written in Nexsun voice. Decide: keep with archival note, rewrite, or remove</w:t>
       </w:r>
     </w:p>
     <w:p>
       <w:pPr>
-        <w:spacing w:after="60"/>
-        <w:ind w:left="360"/>
+        <w:spacing w:after="40"/>
+        <w:ind w:left="216"/>
       </w:pPr>
       <w:r>
         <w:rPr>
+          <w:rFonts w:ascii="Helvetica Neue" w:hAnsi="Helvetica Neue"/>
           <w:b/>
           <w:color w:val="163E64"/>
           <w:sz w:val="22"/>
@@ -1276,32 +1860,35 @@
       </w:r>
       <w:r>
         <w:rPr>
+          <w:rFonts w:ascii="Helvetica Neue" w:hAnsi="Helvetica Neue"/>
           <w:color w:val="3A3A3A"/>
-          <w:sz w:val="21"/>
+          <w:sz w:val="20"/>
         </w:rPr>
         <w:t>Author bios mention Founder, Nexsun.ai in post-10 and similar</w:t>
       </w:r>
     </w:p>
     <w:p>
       <w:pPr>
-        <w:spacing w:before="240" w:after="80"/>
+        <w:spacing w:before="200" w:after="80"/>
       </w:pPr>
       <w:r>
         <w:rPr>
+          <w:rFonts w:ascii="Helvetica Neue" w:hAnsi="Helvetica Neue"/>
           <w:b/>
           <w:color w:val="E95704"/>
-          <w:sz w:val="26"/>
+          <w:sz w:val="23"/>
         </w:rPr>
-        <w:t>B4. Solar SEO pages</w:t>
+        <w:t>B4 · Solar SEO pages</w:t>
       </w:r>
     </w:p>
     <w:p>
       <w:pPr>
-        <w:spacing w:after="60"/>
-        <w:ind w:left="360"/>
+        <w:spacing w:after="40"/>
+        <w:ind w:left="216"/>
       </w:pPr>
       <w:r>
         <w:rPr>
+          <w:rFonts w:ascii="Helvetica Neue" w:hAnsi="Helvetica Neue"/>
           <w:b/>
           <w:color w:val="163E64"/>
           <w:sz w:val="22"/>
@@ -1310,19 +1897,21 @@
       </w:r>
       <w:r>
         <w:rPr>
+          <w:rFonts w:ascii="Helvetica Neue" w:hAnsi="Helvetica Neue"/>
           <w:color w:val="3A3A3A"/>
-          <w:sz w:val="21"/>
+          <w:sz w:val="20"/>
         </w:rPr>
-        <w:t>49 solar city pages built as Nexsun pSEO. Currently pitch decision intelligence to solar buyers</w:t>
+        <w:t>49 solar city pages built as Nexsun pSEO</w:t>
       </w:r>
     </w:p>
     <w:p>
       <w:pPr>
-        <w:spacing w:after="60"/>
-        <w:ind w:left="360"/>
+        <w:spacing w:after="40"/>
+        <w:ind w:left="216"/>
       </w:pPr>
       <w:r>
         <w:rPr>
+          <w:rFonts w:ascii="Helvetica Neue" w:hAnsi="Helvetica Neue"/>
           <w:b/>
           <w:color w:val="163E64"/>
           <w:sz w:val="22"/>
@@ -1331,19 +1920,21 @@
       </w:r>
       <w:r>
         <w:rPr>
+          <w:rFonts w:ascii="Helvetica Neue" w:hAnsi="Helvetica Neue"/>
           <w:color w:val="3A3A3A"/>
-          <w:sz w:val="21"/>
+          <w:sz w:val="20"/>
         </w:rPr>
-        <w:t>Decide: keep with TwoSuns rebrand (auto-replaced), rewrite for new angle, or remove entirely</w:t>
+        <w:t>Decide: keep with TwoSuns rebrand, rewrite for new angle, or remove entirely</w:t>
       </w:r>
     </w:p>
     <w:p>
       <w:pPr>
-        <w:spacing w:after="60"/>
-        <w:ind w:left="360"/>
+        <w:spacing w:after="40"/>
+        <w:ind w:left="216"/>
       </w:pPr>
       <w:r>
         <w:rPr>
+          <w:rFonts w:ascii="Helvetica Neue" w:hAnsi="Helvetica Neue"/>
           <w:b/>
           <w:color w:val="163E64"/>
           <w:sz w:val="22"/>
@@ -1352,57 +1943,106 @@
       </w:r>
       <w:r>
         <w:rPr>
+          <w:rFonts w:ascii="Helvetica Neue" w:hAnsi="Helvetica Neue"/>
           <w:color w:val="3A3A3A"/>
-          <w:sz w:val="21"/>
+          <w:sz w:val="20"/>
         </w:rPr>
         <w:t>Template at seo/solar-city-template.html also needs review</w:t>
       </w:r>
     </w:p>
     <w:p>
       <w:pPr>
-        <w:spacing w:before="240" w:after="240"/>
+        <w:spacing w:before="160" w:after="160"/>
+        <w:pBdr>
+          <w:bottom w:val="single" w:sz="8" w:space="1" w:color="E5E7EB"/>
+        </w:pBdr>
+      </w:pPr>
+    </w:p>
+    <w:tbl>
+      <w:tblPr>
+        <w:tblW w:type="auto" w:w="0"/>
+        <w:jc w:val="left"/>
+        <w:tblLook w:firstColumn="1" w:firstRow="1" w:lastColumn="0" w:lastRow="0" w:noHBand="0" w:noVBand="1" w:val="04A0"/>
+      </w:tblPr>
+      <w:tblGrid>
+        <w:gridCol w:w="9648"/>
+      </w:tblGrid>
+      <w:tr>
+        <w:tc>
+          <w:tcPr>
+            <w:tcW w:type="dxa" w:w="9648"/>
+            <w:shd w:val="clear" w:color="auto" w:fill="163E64"/>
+            <w:tcBorders>
+              <w:top w:val="nil"/>
+              <w:left w:val="nil"/>
+              <w:bottom w:val="nil"/>
+              <w:right w:val="nil"/>
+            </w:tcBorders>
+            <w:vAlign w:val="center"/>
+          </w:tcPr>
+          <w:p>
+            <w:pPr>
+              <w:spacing w:before="40" w:after="40"/>
+              <w:ind w:left="259"/>
+            </w:pPr>
+            <w:r>
+              <w:rPr>
+                <w:rFonts w:ascii="Helvetica Neue" w:hAnsi="Helvetica Neue"/>
+                <w:b/>
+                <w:color w:val="F6B707"/>
+                <w:sz w:val="40"/>
+              </w:rPr>
+              <w:t xml:space="preserve"> C  </w:t>
+            </w:r>
+            <w:r>
+              <w:rPr>
+                <w:rFonts w:ascii="Helvetica Neue" w:hAnsi="Helvetica Neue"/>
+                <w:b/>
+                <w:color w:val="FFFFFF"/>
+                <w:sz w:val="30"/>
+              </w:rPr>
+              <w:t>New TwoSuns sections to add</w:t>
+            </w:r>
+            <w:r>
+              <w:rPr>
+                <w:rFonts w:ascii="Helvetica Neue" w:hAnsi="Helvetica Neue"/>
+                <w:color w:val="F6B707"/>
+                <w:sz w:val="20"/>
+              </w:rPr>
+              <w:t xml:space="preserve">   0/11 done</w:t>
+            </w:r>
+          </w:p>
+        </w:tc>
+      </w:tr>
+    </w:tbl>
+    <w:p>
+      <w:pPr>
+        <w:spacing w:after="120"/>
+      </w:pPr>
+    </w:p>
+    <w:p>
+      <w:pPr>
+        <w:spacing w:after="200"/>
       </w:pPr>
       <w:r>
         <w:rPr>
-          <w:color w:val="CCCCCC"/>
-          <w:sz w:val="16"/>
+          <w:rFonts w:ascii="Helvetica Neue" w:hAnsi="Helvetica Neue"/>
+          <w:b w:val="0"/>
+          <w:i/>
+          <w:color w:val="64748B"/>
+          <w:sz w:val="21"/>
         </w:rPr>
-        <w:t>______________________________________________________________________</w:t>
+        <w:t>Net-new from the TwoSuns Web Content doc. Decide where each lands.</w:t>
       </w:r>
     </w:p>
     <w:p>
       <w:pPr>
-        <w:spacing w:before="400" w:after="120"/>
+        <w:spacing w:after="40"/>
+        <w:ind w:left="216"/>
       </w:pPr>
       <w:r>
         <w:rPr>
-          <w:b/>
-          <w:color w:val="E95704"/>
-          <w:sz w:val="36"/>
-        </w:rPr>
-        <w:t>C. New TwoSuns sections to add</w:t>
-      </w:r>
-    </w:p>
-    <w:p>
-      <w:pPr>
-        <w:spacing w:after="120"/>
-      </w:pPr>
-      <w:r>
-        <w:rPr>
-          <w:i/>
-          <w:color w:val="3A3A3A"/>
-          <w:sz w:val="21"/>
-        </w:rPr>
-        <w:t>From the TwoSuns Web Content doc. Net-new with no current page equivalent. Decide where each lands.</w:t>
-      </w:r>
-    </w:p>
-    <w:p>
-      <w:pPr>
-        <w:spacing w:after="60"/>
-        <w:ind w:left="360"/>
-      </w:pPr>
-      <w:r>
-        <w:rPr>
+          <w:rFonts w:ascii="Helvetica Neue" w:hAnsi="Helvetica Neue"/>
           <w:b/>
           <w:color w:val="163E64"/>
           <w:sz w:val="22"/>
@@ -1411,19 +2051,21 @@
       </w:r>
       <w:r>
         <w:rPr>
+          <w:rFonts w:ascii="Helvetica Neue" w:hAnsi="Helvetica Neue"/>
           <w:color w:val="3A3A3A"/>
-          <w:sz w:val="21"/>
+          <w:sz w:val="20"/>
         </w:rPr>
-        <w:t>Section 2, The Enterprise Challenge (Modern Organizations Operate in Fragments). Homepage or standalone page</w:t>
+        <w:t>Section 2: Enterprise Challenge (Modern Organizations Operate in Fragments)</w:t>
       </w:r>
     </w:p>
     <w:p>
       <w:pPr>
-        <w:spacing w:after="60"/>
-        <w:ind w:left="360"/>
+        <w:spacing w:after="40"/>
+        <w:ind w:left="216"/>
       </w:pPr>
       <w:r>
         <w:rPr>
+          <w:rFonts w:ascii="Helvetica Neue" w:hAnsi="Helvetica Neue"/>
           <w:b/>
           <w:color w:val="163E64"/>
           <w:sz w:val="22"/>
@@ -1432,19 +2074,21 @@
       </w:r>
       <w:r>
         <w:rPr>
+          <w:rFonts w:ascii="Helvetica Neue" w:hAnsi="Helvetica Neue"/>
           <w:color w:val="3A3A3A"/>
-          <w:sz w:val="21"/>
+          <w:sz w:val="20"/>
         </w:rPr>
-        <w:t>Section 3, What is TwoSuns (Persistent Coordination Layer). Could replace current Positioning section on homepage</w:t>
+        <w:t>Section 3: What is TwoSuns (Persistent Coordination Layer)</w:t>
       </w:r>
     </w:p>
     <w:p>
       <w:pPr>
-        <w:spacing w:after="60"/>
-        <w:ind w:left="360"/>
+        <w:spacing w:after="40"/>
+        <w:ind w:left="216"/>
       </w:pPr>
       <w:r>
         <w:rPr>
+          <w:rFonts w:ascii="Helvetica Neue" w:hAnsi="Helvetica Neue"/>
           <w:b/>
           <w:color w:val="163E64"/>
           <w:sz w:val="22"/>
@@ -1453,19 +2097,21 @@
       </w:r>
       <w:r>
         <w:rPr>
+          <w:rFonts w:ascii="Helvetica Neue" w:hAnsi="Helvetica Neue"/>
           <w:color w:val="3A3A3A"/>
-          <w:sz w:val="21"/>
+          <w:sz w:val="20"/>
         </w:rPr>
-        <w:t>Section 4, The TwoSuns Assistant. Slot into modules.html or new assistant.html</w:t>
+        <w:t>Section 4: The TwoSuns Assistant</w:t>
       </w:r>
     </w:p>
     <w:p>
       <w:pPr>
-        <w:spacing w:after="60"/>
-        <w:ind w:left="360"/>
+        <w:spacing w:after="40"/>
+        <w:ind w:left="216"/>
       </w:pPr>
       <w:r>
         <w:rPr>
+          <w:rFonts w:ascii="Helvetica Neue" w:hAnsi="Helvetica Neue"/>
           <w:b/>
           <w:color w:val="163E64"/>
           <w:sz w:val="22"/>
@@ -1474,19 +2120,21 @@
       </w:r>
       <w:r>
         <w:rPr>
+          <w:rFonts w:ascii="Helvetica Neue" w:hAnsi="Helvetica Neue"/>
           <w:color w:val="3A3A3A"/>
-          <w:sz w:val="21"/>
+          <w:sz w:val="20"/>
         </w:rPr>
-        <w:t>Section 5, Platform Structure with Core / Horizon / Forge cards. Restructure platform.html or modules.html</w:t>
+        <w:t>Section 5: Platform Structure (Core / Horizon / Forge cards)</w:t>
       </w:r>
     </w:p>
     <w:p>
       <w:pPr>
-        <w:spacing w:after="60"/>
-        <w:ind w:left="360"/>
+        <w:spacing w:after="40"/>
+        <w:ind w:left="216"/>
       </w:pPr>
       <w:r>
         <w:rPr>
+          <w:rFonts w:ascii="Helvetica Neue" w:hAnsi="Helvetica Neue"/>
           <w:b/>
           <w:color w:val="163E64"/>
           <w:sz w:val="22"/>
@@ -1495,19 +2143,21 @@
       </w:r>
       <w:r>
         <w:rPr>
+          <w:rFonts w:ascii="Helvetica Neue" w:hAnsi="Helvetica Neue"/>
           <w:color w:val="3A3A3A"/>
-          <w:sz w:val="21"/>
+          <w:sz w:val="20"/>
         </w:rPr>
-        <w:t>Section 6, Iterative Operational Environments. Could be a platform.html section</w:t>
+        <w:t>Section 6: Iterative Operational Environments</w:t>
       </w:r>
     </w:p>
     <w:p>
       <w:pPr>
-        <w:spacing w:after="60"/>
-        <w:ind w:left="360"/>
+        <w:spacing w:after="40"/>
+        <w:ind w:left="216"/>
       </w:pPr>
       <w:r>
         <w:rPr>
+          <w:rFonts w:ascii="Helvetica Neue" w:hAnsi="Helvetica Neue"/>
           <w:b/>
           <w:color w:val="163E64"/>
           <w:sz w:val="22"/>
@@ -1516,19 +2166,21 @@
       </w:r>
       <w:r>
         <w:rPr>
+          <w:rFonts w:ascii="Helvetica Neue" w:hAnsi="Helvetica Neue"/>
           <w:color w:val="3A3A3A"/>
-          <w:sz w:val="21"/>
+          <w:sz w:val="20"/>
         </w:rPr>
-        <w:t>Section 7, Decision Picks and Decision Packs expanded. Update existing How TwoSuns Is Applied section</w:t>
+        <w:t>Section 7: Decision Picks and Decision Packs (expanded)</w:t>
       </w:r>
     </w:p>
     <w:p>
       <w:pPr>
-        <w:spacing w:after="60"/>
-        <w:ind w:left="360"/>
+        <w:spacing w:after="40"/>
+        <w:ind w:left="216"/>
       </w:pPr>
       <w:r>
         <w:rPr>
+          <w:rFonts w:ascii="Helvetica Neue" w:hAnsi="Helvetica Neue"/>
           <w:b/>
           <w:color w:val="163E64"/>
           <w:sz w:val="22"/>
@@ -1537,19 +2189,21 @@
       </w:r>
       <w:r>
         <w:rPr>
+          <w:rFonts w:ascii="Helvetica Neue" w:hAnsi="Helvetica Neue"/>
           <w:color w:val="3A3A3A"/>
-          <w:sz w:val="21"/>
+          <w:sz w:val="20"/>
         </w:rPr>
-        <w:t>Section 8, Enterprise Integration. New section on platform.html or technology.html</w:t>
+        <w:t>Section 8: Enterprise Integration</w:t>
       </w:r>
     </w:p>
     <w:p>
       <w:pPr>
-        <w:spacing w:after="60"/>
-        <w:ind w:left="360"/>
+        <w:spacing w:after="40"/>
+        <w:ind w:left="216"/>
       </w:pPr>
       <w:r>
         <w:rPr>
+          <w:rFonts w:ascii="Helvetica Neue" w:hAnsi="Helvetica Neue"/>
           <w:b/>
           <w:color w:val="163E64"/>
           <w:sz w:val="22"/>
@@ -1558,19 +2212,21 @@
       </w:r>
       <w:r>
         <w:rPr>
+          <w:rFonts w:ascii="Helvetica Neue" w:hAnsi="Helvetica Neue"/>
           <w:color w:val="3A3A3A"/>
-          <w:sz w:val="21"/>
+          <w:sz w:val="20"/>
         </w:rPr>
-        <w:t>Section 9, Enterprise Environments with 3 tables. Fits industries.html or applications.html</w:t>
+        <w:t>Section 9: Enterprise Environments (three tables)</w:t>
       </w:r>
     </w:p>
     <w:p>
       <w:pPr>
-        <w:spacing w:after="60"/>
-        <w:ind w:left="360"/>
+        <w:spacing w:after="40"/>
+        <w:ind w:left="216"/>
       </w:pPr>
       <w:r>
         <w:rPr>
+          <w:rFonts w:ascii="Helvetica Neue" w:hAnsi="Helvetica Neue"/>
           <w:b/>
           <w:color w:val="163E64"/>
           <w:sz w:val="22"/>
@@ -1579,19 +2235,21 @@
       </w:r>
       <w:r>
         <w:rPr>
+          <w:rFonts w:ascii="Helvetica Neue" w:hAnsi="Helvetica Neue"/>
           <w:color w:val="3A3A3A"/>
-          <w:sz w:val="21"/>
+          <w:sz w:val="20"/>
         </w:rPr>
-        <w:t>Section 10, Engagement Model with 4 phases. Update engage.html</w:t>
+        <w:t>Section 10: Engagement Model (4 phases)</w:t>
       </w:r>
     </w:p>
     <w:p>
       <w:pPr>
-        <w:spacing w:after="60"/>
-        <w:ind w:left="360"/>
+        <w:spacing w:after="40"/>
+        <w:ind w:left="216"/>
       </w:pPr>
       <w:r>
         <w:rPr>
+          <w:rFonts w:ascii="Helvetica Neue" w:hAnsi="Helvetica Neue"/>
           <w:b/>
           <w:color w:val="163E64"/>
           <w:sz w:val="22"/>
@@ -1600,44 +2258,91 @@
       </w:r>
       <w:r>
         <w:rPr>
+          <w:rFonts w:ascii="Helvetica Neue" w:hAnsi="Helvetica Neue"/>
           <w:color w:val="3A3A3A"/>
-          <w:sz w:val="21"/>
+          <w:sz w:val="20"/>
         </w:rPr>
-        <w:t>Section 11, Closing. "AI will not replace organizations. Organizations that coordinate execution will replace those that do not."</w:t>
+        <w:t>Section 11: Closing — 'AI will not replace organizations. Organizations that coordinate execution will replace those that do not.'</w:t>
       </w:r>
     </w:p>
     <w:p>
       <w:pPr>
-        <w:spacing w:before="240" w:after="240"/>
+        <w:spacing w:before="160" w:after="160"/>
+        <w:pBdr>
+          <w:bottom w:val="single" w:sz="8" w:space="1" w:color="E5E7EB"/>
+        </w:pBdr>
+      </w:pPr>
+    </w:p>
+    <w:tbl>
+      <w:tblPr>
+        <w:tblW w:type="auto" w:w="0"/>
+        <w:jc w:val="left"/>
+        <w:tblLook w:firstColumn="1" w:firstRow="1" w:lastColumn="0" w:lastRow="0" w:noHBand="0" w:noVBand="1" w:val="04A0"/>
+      </w:tblPr>
+      <w:tblGrid>
+        <w:gridCol w:w="9648"/>
+      </w:tblGrid>
+      <w:tr>
+        <w:tc>
+          <w:tcPr>
+            <w:tcW w:type="dxa" w:w="9648"/>
+            <w:shd w:val="clear" w:color="auto" w:fill="163E64"/>
+            <w:tcBorders>
+              <w:top w:val="nil"/>
+              <w:left w:val="nil"/>
+              <w:bottom w:val="nil"/>
+              <w:right w:val="nil"/>
+            </w:tcBorders>
+            <w:vAlign w:val="center"/>
+          </w:tcPr>
+          <w:p>
+            <w:pPr>
+              <w:spacing w:before="40" w:after="40"/>
+              <w:ind w:left="259"/>
+            </w:pPr>
+            <w:r>
+              <w:rPr>
+                <w:rFonts w:ascii="Helvetica Neue" w:hAnsi="Helvetica Neue"/>
+                <w:b/>
+                <w:color w:val="F6B707"/>
+                <w:sz w:val="40"/>
+              </w:rPr>
+              <w:t xml:space="preserve"> D  </w:t>
+            </w:r>
+            <w:r>
+              <w:rPr>
+                <w:rFonts w:ascii="Helvetica Neue" w:hAnsi="Helvetica Neue"/>
+                <w:b/>
+                <w:color w:val="FFFFFF"/>
+                <w:sz w:val="30"/>
+              </w:rPr>
+              <w:t>Assets to refresh</w:t>
+            </w:r>
+            <w:r>
+              <w:rPr>
+                <w:rFonts w:ascii="Helvetica Neue" w:hAnsi="Helvetica Neue"/>
+                <w:color w:val="F6B707"/>
+                <w:sz w:val="20"/>
+              </w:rPr>
+              <w:t xml:space="preserve">   0/4 done</w:t>
+            </w:r>
+          </w:p>
+        </w:tc>
+      </w:tr>
+    </w:tbl>
+    <w:p>
+      <w:pPr>
+        <w:spacing w:after="120"/>
+      </w:pPr>
+    </w:p>
+    <w:p>
+      <w:pPr>
+        <w:spacing w:after="40"/>
+        <w:ind w:left="216"/>
       </w:pPr>
       <w:r>
         <w:rPr>
-          <w:color w:val="CCCCCC"/>
-          <w:sz w:val="16"/>
-        </w:rPr>
-        <w:t>______________________________________________________________________</w:t>
-      </w:r>
-    </w:p>
-    <w:p>
-      <w:pPr>
-        <w:spacing w:before="400" w:after="120"/>
-      </w:pPr>
-      <w:r>
-        <w:rPr>
-          <w:b/>
-          <w:color w:val="E95704"/>
-          <w:sz w:val="36"/>
-        </w:rPr>
-        <w:t>D. Assets to refresh</w:t>
-      </w:r>
-    </w:p>
-    <w:p>
-      <w:pPr>
-        <w:spacing w:after="60"/>
-        <w:ind w:left="360"/>
-      </w:pPr>
-      <w:r>
-        <w:rPr>
+          <w:rFonts w:ascii="Helvetica Neue" w:hAnsi="Helvetica Neue"/>
           <w:b/>
           <w:color w:val="163E64"/>
           <w:sz w:val="22"/>
@@ -1646,19 +2351,21 @@
       </w:r>
       <w:r>
         <w:rPr>
+          <w:rFonts w:ascii="Helvetica Neue" w:hAnsi="Helvetica Neue"/>
           <w:color w:val="3A3A3A"/>
-          <w:sz w:val="21"/>
+          <w:sz w:val="20"/>
         </w:rPr>
-        <w:t>Favicon (logo-mini.svg). Currently sun-only mini. Could update to TwoSuns mini-mark with both suns</w:t>
+        <w:t>Favicon (logo-mini.svg): currently sun-only mini, could update to TwoSuns mini-mark with both suns</w:t>
       </w:r>
     </w:p>
     <w:p>
       <w:pPr>
-        <w:spacing w:after="60"/>
-        <w:ind w:left="360"/>
+        <w:spacing w:after="40"/>
+        <w:ind w:left="216"/>
       </w:pPr>
       <w:r>
         <w:rPr>
+          <w:rFonts w:ascii="Helvetica Neue" w:hAnsi="Helvetica Neue"/>
           <w:b/>
           <w:color w:val="163E64"/>
           <w:sz w:val="22"/>
@@ -1667,19 +2374,21 @@
       </w:r>
       <w:r>
         <w:rPr>
+          <w:rFonts w:ascii="Helvetica Neue" w:hAnsi="Helvetica Neue"/>
           <w:color w:val="3A3A3A"/>
-          <w:sz w:val="21"/>
+          <w:sz w:val="20"/>
         </w:rPr>
-        <w:t>og-image.jpg at site root. Currently Nexsun-branded social share image</w:t>
+        <w:t>og-image.jpg: currently Nexsun-branded social share image</w:t>
       </w:r>
     </w:p>
     <w:p>
       <w:pPr>
-        <w:spacing w:after="60"/>
-        <w:ind w:left="360"/>
+        <w:spacing w:after="40"/>
+        <w:ind w:left="216"/>
       </w:pPr>
       <w:r>
         <w:rPr>
+          <w:rFonts w:ascii="Helvetica Neue" w:hAnsi="Helvetica Neue"/>
           <w:b/>
           <w:color w:val="163E64"/>
           <w:sz w:val="22"/>
@@ -1688,19 +2397,21 @@
       </w:r>
       <w:r>
         <w:rPr>
+          <w:rFonts w:ascii="Helvetica Neue" w:hAnsi="Helvetica Neue"/>
           <w:color w:val="3A3A3A"/>
-          <w:sz w:val="21"/>
+          <w:sz w:val="20"/>
         </w:rPr>
-        <w:t>Logos 2/ kit folder. Currently has Nexsun logo files. Generate TwoSuns kit</w:t>
+        <w:t>Logos 2/ kit folder: currently has Nexsun logo files</w:t>
       </w:r>
     </w:p>
     <w:p>
       <w:pPr>
-        <w:spacing w:after="60"/>
-        <w:ind w:left="360"/>
+        <w:spacing w:after="40"/>
+        <w:ind w:left="216"/>
       </w:pPr>
       <w:r>
         <w:rPr>
+          <w:rFonts w:ascii="Helvetica Neue" w:hAnsi="Helvetica Neue"/>
           <w:b/>
           <w:color w:val="163E64"/>
           <w:sz w:val="22"/>
@@ -1709,44 +2420,91 @@
       </w:r>
       <w:r>
         <w:rPr>
+          <w:rFonts w:ascii="Helvetica Neue" w:hAnsi="Helvetica Neue"/>
           <w:color w:val="3A3A3A"/>
-          <w:sz w:val="21"/>
+          <w:sz w:val="20"/>
         </w:rPr>
-        <w:t>Press kit assets at press.html. Reference Nexsun bios, headshots labeled with Nexsun roles</w:t>
+        <w:t>Press kit assets: reference Nexsun bios, headshots labeled with Nexsun roles</w:t>
       </w:r>
     </w:p>
     <w:p>
       <w:pPr>
-        <w:spacing w:before="240" w:after="240"/>
+        <w:spacing w:before="160" w:after="160"/>
+        <w:pBdr>
+          <w:bottom w:val="single" w:sz="8" w:space="1" w:color="E5E7EB"/>
+        </w:pBdr>
+      </w:pPr>
+    </w:p>
+    <w:tbl>
+      <w:tblPr>
+        <w:tblW w:type="auto" w:w="0"/>
+        <w:jc w:val="left"/>
+        <w:tblLook w:firstColumn="1" w:firstRow="1" w:lastColumn="0" w:lastRow="0" w:noHBand="0" w:noVBand="1" w:val="04A0"/>
+      </w:tblPr>
+      <w:tblGrid>
+        <w:gridCol w:w="9648"/>
+      </w:tblGrid>
+      <w:tr>
+        <w:tc>
+          <w:tcPr>
+            <w:tcW w:type="dxa" w:w="9648"/>
+            <w:shd w:val="clear" w:color="auto" w:fill="163E64"/>
+            <w:tcBorders>
+              <w:top w:val="nil"/>
+              <w:left w:val="nil"/>
+              <w:bottom w:val="nil"/>
+              <w:right w:val="nil"/>
+            </w:tcBorders>
+            <w:vAlign w:val="center"/>
+          </w:tcPr>
+          <w:p>
+            <w:pPr>
+              <w:spacing w:before="40" w:after="40"/>
+              <w:ind w:left="259"/>
+            </w:pPr>
+            <w:r>
+              <w:rPr>
+                <w:rFonts w:ascii="Helvetica Neue" w:hAnsi="Helvetica Neue"/>
+                <w:b/>
+                <w:color w:val="F6B707"/>
+                <w:sz w:val="40"/>
+              </w:rPr>
+              <w:t xml:space="preserve"> E  </w:t>
+            </w:r>
+            <w:r>
+              <w:rPr>
+                <w:rFonts w:ascii="Helvetica Neue" w:hAnsi="Helvetica Neue"/>
+                <w:b/>
+                <w:color w:val="FFFFFF"/>
+                <w:sz w:val="30"/>
+              </w:rPr>
+              <w:t>URL and infrastructure</w:t>
+            </w:r>
+            <w:r>
+              <w:rPr>
+                <w:rFonts w:ascii="Helvetica Neue" w:hAnsi="Helvetica Neue"/>
+                <w:color w:val="F6B707"/>
+                <w:sz w:val="20"/>
+              </w:rPr>
+              <w:t xml:space="preserve">   0/7 done</w:t>
+            </w:r>
+          </w:p>
+        </w:tc>
+      </w:tr>
+    </w:tbl>
+    <w:p>
+      <w:pPr>
+        <w:spacing w:after="120"/>
+      </w:pPr>
+    </w:p>
+    <w:p>
+      <w:pPr>
+        <w:spacing w:after="40"/>
+        <w:ind w:left="216"/>
       </w:pPr>
       <w:r>
         <w:rPr>
-          <w:color w:val="CCCCCC"/>
-          <w:sz w:val="16"/>
-        </w:rPr>
-        <w:t>______________________________________________________________________</w:t>
-      </w:r>
-    </w:p>
-    <w:p>
-      <w:pPr>
-        <w:spacing w:before="400" w:after="120"/>
-      </w:pPr>
-      <w:r>
-        <w:rPr>
-          <w:b/>
-          <w:color w:val="E95704"/>
-          <w:sz w:val="36"/>
-        </w:rPr>
-        <w:t>E. URL and infrastructure</w:t>
-      </w:r>
-    </w:p>
-    <w:p>
-      <w:pPr>
-        <w:spacing w:after="60"/>
-        <w:ind w:left="360"/>
-      </w:pPr>
-      <w:r>
-        <w:rPr>
+          <w:rFonts w:ascii="Helvetica Neue" w:hAnsi="Helvetica Neue"/>
           <w:b/>
           <w:color w:val="163E64"/>
           <w:sz w:val="22"/>
@@ -1755,19 +2513,21 @@
       </w:r>
       <w:r>
         <w:rPr>
+          <w:rFonts w:ascii="Helvetica Neue" w:hAnsi="Helvetica Neue"/>
           <w:color w:val="3A3A3A"/>
-          <w:sz w:val="21"/>
+          <w:sz w:val="20"/>
         </w:rPr>
         <w:t>Rename why-nexsun.html to why-twosuns.html and update all internal links</w:t>
       </w:r>
     </w:p>
     <w:p>
       <w:pPr>
-        <w:spacing w:after="60"/>
-        <w:ind w:left="360"/>
+        <w:spacing w:after="40"/>
+        <w:ind w:left="216"/>
       </w:pPr>
       <w:r>
         <w:rPr>
+          <w:rFonts w:ascii="Helvetica Neue" w:hAnsi="Helvetica Neue"/>
           <w:b/>
           <w:color w:val="163E64"/>
           <w:sz w:val="22"/>
@@ -1776,19 +2536,21 @@
       </w:r>
       <w:r>
         <w:rPr>
+          <w:rFonts w:ascii="Helvetica Neue" w:hAnsi="Helvetica Neue"/>
           <w:color w:val="3A3A3A"/>
-          <w:sz w:val="21"/>
+          <w:sz w:val="20"/>
         </w:rPr>
         <w:t>Decide on domain. nexsun.ai is current. If acquiring twosuns.ai, plan redirect strategy</w:t>
       </w:r>
     </w:p>
     <w:p>
       <w:pPr>
-        <w:spacing w:after="60"/>
-        <w:ind w:left="360"/>
+        <w:spacing w:after="40"/>
+        <w:ind w:left="216"/>
       </w:pPr>
       <w:r>
         <w:rPr>
+          <w:rFonts w:ascii="Helvetica Neue" w:hAnsi="Helvetica Neue"/>
           <w:b/>
           <w:color w:val="163E64"/>
           <w:sz w:val="22"/>
@@ -1797,19 +2559,21 @@
       </w:r>
       <w:r>
         <w:rPr>
+          <w:rFonts w:ascii="Helvetica Neue" w:hAnsi="Helvetica Neue"/>
           <w:color w:val="3A3A3A"/>
-          <w:sz w:val="21"/>
+          <w:sz w:val="20"/>
         </w:rPr>
         <w:t>Update sitemap.xml with any URL renames</w:t>
       </w:r>
     </w:p>
     <w:p>
       <w:pPr>
-        <w:spacing w:after="60"/>
-        <w:ind w:left="360"/>
+        <w:spacing w:after="40"/>
+        <w:ind w:left="216"/>
       </w:pPr>
       <w:r>
         <w:rPr>
+          <w:rFonts w:ascii="Helvetica Neue" w:hAnsi="Helvetica Neue"/>
           <w:b/>
           <w:color w:val="163E64"/>
           <w:sz w:val="22"/>
@@ -1818,19 +2582,21 @@
       </w:r>
       <w:r>
         <w:rPr>
+          <w:rFonts w:ascii="Helvetica Neue" w:hAnsi="Helvetica Neue"/>
           <w:color w:val="3A3A3A"/>
-          <w:sz w:val="21"/>
+          <w:sz w:val="20"/>
         </w:rPr>
         <w:t>Update robots.txt if needed</w:t>
       </w:r>
     </w:p>
     <w:p>
       <w:pPr>
-        <w:spacing w:after="60"/>
-        <w:ind w:left="360"/>
+        <w:spacing w:after="40"/>
+        <w:ind w:left="216"/>
       </w:pPr>
       <w:r>
         <w:rPr>
+          <w:rFonts w:ascii="Helvetica Neue" w:hAnsi="Helvetica Neue"/>
           <w:b/>
           <w:color w:val="163E64"/>
           <w:sz w:val="22"/>
@@ -1839,19 +2605,21 @@
       </w:r>
       <w:r>
         <w:rPr>
+          <w:rFonts w:ascii="Helvetica Neue" w:hAnsi="Helvetica Neue"/>
           <w:color w:val="3A3A3A"/>
-          <w:sz w:val="21"/>
+          <w:sz w:val="20"/>
         </w:rPr>
-        <w:t>Schema.org markup on each page references Nexsun.ai name. Update to TwoSuns</w:t>
+        <w:t>Schema.org markup on each page still references Nexsun.ai name. Update to TwoSuns</w:t>
       </w:r>
     </w:p>
     <w:p>
       <w:pPr>
-        <w:spacing w:after="60"/>
-        <w:ind w:left="360"/>
+        <w:spacing w:after="40"/>
+        <w:ind w:left="216"/>
       </w:pPr>
       <w:r>
         <w:rPr>
+          <w:rFonts w:ascii="Helvetica Neue" w:hAnsi="Helvetica Neue"/>
           <w:b/>
           <w:color w:val="163E64"/>
           <w:sz w:val="22"/>
@@ -1860,19 +2628,21 @@
       </w:r>
       <w:r>
         <w:rPr>
+          <w:rFonts w:ascii="Helvetica Neue" w:hAnsi="Helvetica Neue"/>
           <w:color w:val="3A3A3A"/>
-          <w:sz w:val="21"/>
+          <w:sz w:val="20"/>
         </w:rPr>
-        <w:t>LinkedIn URL placeholder updated to linkedin.com/company/twosuns (page doesn’t exist yet)</w:t>
+        <w:t>LinkedIn URL placeholder: linkedin.com/company/twosuns (page does not exist yet)</w:t>
       </w:r>
     </w:p>
     <w:p>
       <w:pPr>
-        <w:spacing w:after="60"/>
-        <w:ind w:left="360"/>
+        <w:spacing w:after="40"/>
+        <w:ind w:left="216"/>
       </w:pPr>
       <w:r>
         <w:rPr>
+          <w:rFonts w:ascii="Helvetica Neue" w:hAnsi="Helvetica Neue"/>
           <w:b/>
           <w:color w:val="163E64"/>
           <w:sz w:val="22"/>
@@ -1881,36 +2651,74 @@
       </w:r>
       <w:r>
         <w:rPr>
+          <w:rFonts w:ascii="Helvetica Neue" w:hAnsi="Helvetica Neue"/>
           <w:color w:val="3A3A3A"/>
-          <w:sz w:val="21"/>
+          <w:sz w:val="20"/>
         </w:rPr>
-        <w:t>X/Twitter URL placeholder updated to x.com/TwoSunsAI (handle doesn’t exist yet)</w:t>
+        <w:t>X/Twitter URL placeholder: x.com/TwoSunsAI (handle does not exist yet)</w:t>
       </w:r>
     </w:p>
     <w:p>
       <w:pPr>
-        <w:spacing w:before="240" w:after="240"/>
+        <w:spacing w:before="160" w:after="160"/>
+        <w:pBdr>
+          <w:bottom w:val="single" w:sz="8" w:space="1" w:color="E5E7EB"/>
+        </w:pBdr>
       </w:pPr>
-      <w:r>
-        <w:rPr>
-          <w:color w:val="CCCCCC"/>
-          <w:sz w:val="16"/>
-        </w:rPr>
-        <w:t>______________________________________________________________________</w:t>
-      </w:r>
     </w:p>
+    <w:tbl>
+      <w:tblPr>
+        <w:tblW w:type="auto" w:w="0"/>
+        <w:jc w:val="left"/>
+        <w:tblLook w:firstColumn="1" w:firstRow="1" w:lastColumn="0" w:lastRow="0" w:noHBand="0" w:noVBand="1" w:val="04A0"/>
+      </w:tblPr>
+      <w:tblGrid>
+        <w:gridCol w:w="9648"/>
+      </w:tblGrid>
+      <w:tr>
+        <w:tc>
+          <w:tcPr>
+            <w:tcW w:type="dxa" w:w="9648"/>
+            <w:shd w:val="clear" w:color="auto" w:fill="163E64"/>
+            <w:tcBorders>
+              <w:top w:val="nil"/>
+              <w:left w:val="nil"/>
+              <w:bottom w:val="nil"/>
+              <w:right w:val="nil"/>
+            </w:tcBorders>
+            <w:vAlign w:val="center"/>
+          </w:tcPr>
+          <w:p>
+            <w:pPr>
+              <w:spacing w:before="40" w:after="40"/>
+              <w:ind w:left="259"/>
+            </w:pPr>
+            <w:r>
+              <w:rPr>
+                <w:rFonts w:ascii="Helvetica Neue" w:hAnsi="Helvetica Neue"/>
+                <w:b/>
+                <w:color w:val="F6B707"/>
+                <w:sz w:val="40"/>
+              </w:rPr>
+              <w:t xml:space="preserve"> F  </w:t>
+            </w:r>
+            <w:r>
+              <w:rPr>
+                <w:rFonts w:ascii="Helvetica Neue" w:hAnsi="Helvetica Neue"/>
+                <w:b/>
+                <w:color w:val="FFFFFF"/>
+                <w:sz w:val="30"/>
+              </w:rPr>
+              <w:t>Notes and tradeoffs</w:t>
+            </w:r>
+          </w:p>
+        </w:tc>
+      </w:tr>
+    </w:tbl>
     <w:p>
       <w:pPr>
-        <w:spacing w:before="400" w:after="120"/>
+        <w:spacing w:after="120"/>
       </w:pPr>
-      <w:r>
-        <w:rPr>
-          <w:b/>
-          <w:color w:val="E95704"/>
-          <w:sz w:val="36"/>
-        </w:rPr>
-        <w:t>F. Notes and tradeoffs</w:t>
-      </w:r>
     </w:p>
     <w:p>
       <w:pPr>
@@ -1923,12 +2731,13 @@
           <w:color w:val="E95704"/>
           <w:sz w:val="22"/>
         </w:rPr>
-        <w:t xml:space="preserve">•  </w:t>
+        <w:t xml:space="preserve">◆  </w:t>
       </w:r>
       <w:r>
         <w:rPr>
+          <w:rFonts w:ascii="Helvetica Neue" w:hAnsi="Helvetica Neue"/>
           <w:color w:val="3A3A3A"/>
-          <w:sz w:val="21"/>
+          <w:sz w:val="20"/>
         </w:rPr>
         <w:t>Homepage hero is on the new TwoSuns positioning, but the rest of the homepage (Positioning, Why TwoSuns, Modules at a Glance) still uses Nexsun-era structure. Visually consistent (brand applied), but deeper messaging still leans on Decision Intelligence framing rather than Coordination Infrastructure framing.</w:t>
       </w:r>
@@ -1944,12 +2753,13 @@
           <w:color w:val="E95704"/>
           <w:sz w:val="22"/>
         </w:rPr>
-        <w:t xml:space="preserve">•  </w:t>
+        <w:t xml:space="preserve">◆  </w:t>
       </w:r>
       <w:r>
         <w:rPr>
+          <w:rFonts w:ascii="Helvetica Neue" w:hAnsi="Helvetica Neue"/>
           <w:color w:val="3A3A3A"/>
-          <w:sz w:val="21"/>
+          <w:sz w:val="20"/>
         </w:rPr>
         <w:t>Decision Picks and Decision Packs are KEPT in the TwoSuns brief, so those terms remain valid.</w:t>
       </w:r>
@@ -1965,12 +2775,13 @@
           <w:color w:val="E95704"/>
           <w:sz w:val="22"/>
         </w:rPr>
-        <w:t xml:space="preserve">•  </w:t>
+        <w:t xml:space="preserve">◆  </w:t>
       </w:r>
       <w:r>
         <w:rPr>
+          <w:rFonts w:ascii="Helvetica Neue" w:hAnsi="Helvetica Neue"/>
           <w:color w:val="3A3A3A"/>
-          <w:sz w:val="21"/>
+          <w:sz w:val="20"/>
         </w:rPr>
         <w:t>The cinematic Tatooine reference in the TwoSuns doc is not surfaced anywhere. Could be a small homage in a brand film or About page.</w:t>
       </w:r>
@@ -1986,40 +2797,78 @@
           <w:color w:val="E95704"/>
           <w:sz w:val="22"/>
         </w:rPr>
-        <w:t xml:space="preserve">•  </w:t>
+        <w:t xml:space="preserve">◆  </w:t>
       </w:r>
       <w:r>
         <w:rPr>
+          <w:rFonts w:ascii="Helvetica Neue" w:hAnsi="Helvetica Neue"/>
           <w:color w:val="3A3A3A"/>
-          <w:sz w:val="21"/>
+          <w:sz w:val="20"/>
         </w:rPr>
-        <w:t>Design guidance in the TwoSuns doc (cinematic, restrained, etc.) mostly aligns with the existing Nexsun design system. No major visual overhaul needed unless desired.</w:t>
+        <w:t>Design guidance in the TwoSuns doc (cinematic, restrained, enterprise-grade) mostly aligns with the existing Nexsun design system. No major visual overhaul needed unless desired.</w:t>
       </w:r>
     </w:p>
     <w:p>
       <w:pPr>
-        <w:spacing w:before="240" w:after="240"/>
+        <w:spacing w:before="160" w:after="160"/>
+        <w:pBdr>
+          <w:bottom w:val="single" w:sz="8" w:space="1" w:color="E5E7EB"/>
+        </w:pBdr>
       </w:pPr>
-      <w:r>
-        <w:rPr>
-          <w:color w:val="CCCCCC"/>
-          <w:sz w:val="16"/>
-        </w:rPr>
-        <w:t>______________________________________________________________________</w:t>
-      </w:r>
     </w:p>
+    <w:tbl>
+      <w:tblPr>
+        <w:tblW w:type="auto" w:w="0"/>
+        <w:jc w:val="left"/>
+        <w:tblLook w:firstColumn="1" w:firstRow="1" w:lastColumn="0" w:lastRow="0" w:noHBand="0" w:noVBand="1" w:val="04A0"/>
+      </w:tblPr>
+      <w:tblGrid>
+        <w:gridCol w:w="9648"/>
+      </w:tblGrid>
+      <w:tr>
+        <w:tc>
+          <w:tcPr>
+            <w:tcW w:type="dxa" w:w="9648"/>
+            <w:shd w:val="clear" w:color="auto" w:fill="163E64"/>
+            <w:tcBorders>
+              <w:top w:val="nil"/>
+              <w:left w:val="nil"/>
+              <w:bottom w:val="nil"/>
+              <w:right w:val="nil"/>
+            </w:tcBorders>
+            <w:vAlign w:val="center"/>
+          </w:tcPr>
+          <w:p>
+            <w:pPr>
+              <w:spacing w:before="40" w:after="40"/>
+              <w:ind w:left="259"/>
+            </w:pPr>
+            <w:r>
+              <w:rPr>
+                <w:rFonts w:ascii="Helvetica Neue" w:hAnsi="Helvetica Neue"/>
+                <w:b/>
+                <w:color w:val="F6B707"/>
+                <w:sz w:val="40"/>
+              </w:rPr>
+              <w:t xml:space="preserve"> G  </w:t>
+            </w:r>
+            <w:r>
+              <w:rPr>
+                <w:rFonts w:ascii="Helvetica Neue" w:hAnsi="Helvetica Neue"/>
+                <w:b/>
+                <w:color w:val="FFFFFF"/>
+                <w:sz w:val="30"/>
+              </w:rPr>
+              <w:t>Working rules carried forward</w:t>
+            </w:r>
+          </w:p>
+        </w:tc>
+      </w:tr>
+    </w:tbl>
     <w:p>
       <w:pPr>
-        <w:spacing w:before="400" w:after="120"/>
+        <w:spacing w:after="120"/>
       </w:pPr>
-      <w:r>
-        <w:rPr>
-          <w:b/>
-          <w:color w:val="E95704"/>
-          <w:sz w:val="36"/>
-        </w:rPr>
-        <w:t>G. Working rules carried forward</w:t>
-      </w:r>
     </w:p>
     <w:p>
       <w:pPr>
@@ -2032,12 +2881,13 @@
           <w:color w:val="163E64"/>
           <w:sz w:val="22"/>
         </w:rPr>
-        <w:t xml:space="preserve">•  </w:t>
+        <w:t xml:space="preserve">›  </w:t>
       </w:r>
       <w:r>
         <w:rPr>
+          <w:rFonts w:ascii="Helvetica Neue" w:hAnsi="Helvetica Neue"/>
           <w:color w:val="3A3A3A"/>
-          <w:sz w:val="21"/>
+          <w:sz w:val="20"/>
         </w:rPr>
         <w:t>No em dashes anywhere. Use commas. CEO rule.</w:t>
       </w:r>
@@ -2053,12 +2903,13 @@
           <w:color w:val="163E64"/>
           <w:sz w:val="22"/>
         </w:rPr>
-        <w:t xml:space="preserve">•  </w:t>
+        <w:t xml:space="preserve">›  </w:t>
       </w:r>
       <w:r>
         <w:rPr>
+          <w:rFonts w:ascii="Helvetica Neue" w:hAnsi="Helvetica Neue"/>
           <w:color w:val="3A3A3A"/>
-          <w:sz w:val="21"/>
+          <w:sz w:val="20"/>
         </w:rPr>
         <w:t>Never false-verify. Read files back after edits.</w:t>
       </w:r>
@@ -2074,12 +2925,13 @@
           <w:color w:val="163E64"/>
           <w:sz w:val="22"/>
         </w:rPr>
-        <w:t xml:space="preserve">•  </w:t>
+        <w:t xml:space="preserve">›  </w:t>
       </w:r>
       <w:r>
         <w:rPr>
+          <w:rFonts w:ascii="Helvetica Neue" w:hAnsi="Helvetica Neue"/>
           <w:color w:val="3A3A3A"/>
-          <w:sz w:val="21"/>
+          <w:sz w:val="20"/>
         </w:rPr>
         <w:t>Brainstorm mode for new content directions. Capture, discuss, wait for go-ahead.</w:t>
       </w:r>
@@ -2095,26 +2947,58 @@
           <w:color w:val="163E64"/>
           <w:sz w:val="22"/>
         </w:rPr>
-        <w:t xml:space="preserve">•  </w:t>
+        <w:t xml:space="preserve">›  </w:t>
       </w:r>
       <w:r>
         <w:rPr>
+          <w:rFonts w:ascii="Helvetica Neue" w:hAnsi="Helvetica Neue"/>
           <w:color w:val="3A3A3A"/>
-          <w:sz w:val="21"/>
+          <w:sz w:val="20"/>
         </w:rPr>
-        <w:t>Backups preserved at nexsun-backup-pre-twosuns-2026-04-30/ and .logo-backups/ if revert needed.</w:t>
+        <w:t>Backups preserved at nexsun-backup-pre-twosuns-2026-04-30/ and .logo-backups/.</w:t>
       </w:r>
     </w:p>
     <w:p>
       <w:pPr>
-        <w:spacing w:before="240" w:after="240"/>
+        <w:spacing w:after="400"/>
+      </w:pPr>
+    </w:p>
+    <w:p>
+      <w:pPr>
+        <w:spacing w:before="160" w:after="160"/>
+        <w:pBdr>
+          <w:bottom w:val="single" w:sz="14" w:space="1" w:color="F4920B"/>
+        </w:pBdr>
+      </w:pPr>
+    </w:p>
+    <w:p>
+      <w:pPr>
+        <w:spacing w:before="160"/>
+        <w:jc w:val="center"/>
       </w:pPr>
       <w:r>
         <w:rPr>
-          <w:color w:val="CCCCCC"/>
-          <w:sz w:val="16"/>
+          <w:rFonts w:ascii="Helvetica Neue" w:hAnsi="Helvetica Neue"/>
+          <w:b/>
+          <w:color w:val="E95704"/>
+          <w:sz w:val="22"/>
         </w:rPr>
-        <w:t>______________________________________________________________________</w:t>
+        <w:t>☼  T W O S U N S  ☼</w:t>
+      </w:r>
+    </w:p>
+    <w:p>
+      <w:pPr>
+        <w:spacing w:after="0"/>
+        <w:jc w:val="center"/>
+      </w:pPr>
+      <w:r>
+        <w:rPr>
+          <w:rFonts w:ascii="Helvetica Neue" w:hAnsi="Helvetica Neue"/>
+          <w:i/>
+          <w:color w:val="64748B"/>
+          <w:sz w:val="18"/>
+        </w:rPr>
+        <w:t>Coordination Infrastructure for Complex Enterprises</w:t>
       </w:r>
     </w:p>
     <w:p>
@@ -2123,16 +3007,16 @@
       </w:pPr>
       <w:r>
         <w:rPr>
-          <w:i/>
-          <w:color w:val="64748B"/>
-          <w:sz w:val="18"/>
+          <w:rFonts w:ascii="Helvetica Neue" w:hAnsi="Helvetica Neue"/>
+          <w:color w:val="CBD5E1"/>
+          <w:sz w:val="16"/>
         </w:rPr>
-        <w:t>TwoSuns Rebrand Checklist  -  Generated 2026-04-30</w:t>
+        <w:t>Rebrand checklist generated 2026-04-30</w:t>
       </w:r>
     </w:p>
     <w:sectPr>
       <w:pgSz w:w="12240" w:h="15840"/>
-      <w:pgMar w:top="1152" w:right="1440" w:bottom="1152" w:left="1440" w:header="720" w:footer="720" w:gutter="0"/>
+      <w:pgMar w:top="1008" w:right="1296" w:bottom="1008" w:left="1296" w:header="720" w:footer="720" w:gutter="0"/>
       <w:cols w:space="720"/>
       <w:docGrid w:linePitch="360"/>
     </w:sectPr>

</xml_diff>